<commit_message>
Refresh tracker copy and research statuses
</commit_message>
<xml_diff>
--- a/tracker_copy_edit_dynamic.docx
+++ b/tracker_copy_edit_dynamic.docx
@@ -1020,17 +1020,17 @@
     </w:p>
     <w:p>
       <w:r>
-        <w:t xml:space="preserve">College Financial Health Explorer</w:t>
-      </w:r>
-    </w:p>
-    <w:p>
-      <w:r>
-        <w:t xml:space="preserve"/>
-      </w:r>
-    </w:p>
-    <w:p>
-      <w:r>
-        <w:t xml:space="preserve">Navigation tabs: Home | Finances | College Cuts | Accreditation | Research Funding Cuts | Methodology</w:t>
+        <w:t xml:space="preserve">College Financial Health Tracker</w:t>
+      </w:r>
+    </w:p>
+    <w:p>
+      <w:r>
+        <w:t xml:space="preserve"/>
+      </w:r>
+    </w:p>
+    <w:p>
+      <w:r>
+        <w:t xml:space="preserve">Navigation tabs: Tracker Home | Finances | College Cuts | Accreditation | Research Funding Cuts | Methodology</w:t>
       </w:r>
     </w:p>
     <w:p>
@@ -1062,7 +1062,7 @@
     </w:p>
     <w:p>
       <w:r>
-        <w:t xml:space="preserve">Start typing a college name, city, state, alias or IPEDS ID</w:t>
+        <w:t xml:space="preserve">Start typing a college name, city, state or nickname</w:t>
       </w:r>
     </w:p>
     <w:p>
@@ -1084,7 +1084,7 @@
     </w:p>
     <w:p>
       <w:r>
-        <w:t xml:space="preserve">New to this tool? Here’s a guide.</w:t>
+        <w:t xml:space="preserve">New to this tool? Here's a guide.</w:t>
       </w:r>
     </w:p>
     <w:p>
@@ -1108,17 +1108,17 @@
           <w:b/>
           <w:bCs/>
         </w:rPr>
-        <w:t xml:space="preserve">How can you figure out how a college is doing financially?</w:t>
-      </w:r>
-    </w:p>
-    <w:p>
-      <w:r>
-        <w:t xml:space="preserve"/>
-      </w:r>
-    </w:p>
-    <w:p>
-      <w:r>
-        <w:t xml:space="preserve">It can be tough for students and families to find answers. The Hechinger Report created this free tool to help at a critical moment.</w:t>
+        <w:t xml:space="preserve">How can you figure out how healthy a college's finances are?</w:t>
+      </w:r>
+    </w:p>
+    <w:p>
+      <w:r>
+        <w:t xml:space="preserve"/>
+      </w:r>
+    </w:p>
+    <w:p>
+      <w:r>
+        <w:t xml:space="preserve">It can be tough for students and families to find answers. The Hechinger Report created this free tool to help.</w:t>
       </w:r>
     </w:p>
     <w:p>
@@ -1148,7 +1148,7 @@
     </w:p>
     <w:p>
       <w:r>
-        <w:t xml:space="preserve">In the search bar, look up a four-year college or university for a snapshot of key financial and enrollment trends over the past decade.</w:t>
+        <w:t xml:space="preserve">In the search bar, look up a four-year college or university for key financial and enrollment trends over the past decade.</w:t>
       </w:r>
     </w:p>
     <w:p>
@@ -1203,7 +1203,7 @@
         <w:t xml:space="preserve">Page heading: </w:t>
       </w:r>
       <w:r>
-        <w:t xml:space="preserve">College Financial Health Explorer</w:t>
+        <w:t xml:space="preserve">College Financial Health Tracker</w:t>
       </w:r>
     </w:p>
     <w:p>
@@ -1234,10 +1234,49 @@
           <w:b/>
           <w:bCs/>
         </w:rPr>
+        <w:t xml:space="preserve">Search label (screen reader): </w:t>
+      </w:r>
+      <w:r>
+        <w:t xml:space="preserve">Search by institution:</w:t>
+      </w:r>
+    </w:p>
+    <w:p>
+      <w:r>
+        <w:t xml:space="preserve"/>
+      </w:r>
+    </w:p>
+    <w:p>
+      <w:r>
+        <w:rPr>
+          <w:b/>
+          <w:bCs/>
+          <w:color w:val="777777"/>
+          <w:sz w:val="18"/>
+          <w:szCs w:val="18"/>
+        </w:rPr>
+        <w:t xml:space="preserve">SEARCH PLACEHOLDER</w:t>
+      </w:r>
+    </w:p>
+    <w:p>
+      <w:r>
+        <w:t xml:space="preserve">Start typing a college name, city, state or nickname</w:t>
+      </w:r>
+    </w:p>
+    <w:p>
+      <w:r>
+        <w:t xml:space="preserve"/>
+      </w:r>
+    </w:p>
+    <w:p>
+      <w:r>
+        <w:rPr>
+          <w:b/>
+          <w:bCs/>
+        </w:rPr>
         <w:t xml:space="preserve">Help tooltip: </w:t>
       </w:r>
       <w:r>
-        <w:t xml:space="preserve">Questions about this explorer? Email us here.</w:t>
+        <w:t xml:space="preserve">Questions about this tracker? Email us here.</w:t>
       </w:r>
     </w:p>
     <w:p>
@@ -1288,7 +1327,7 @@
         </w:numPr>
       </w:pPr>
       <w:r>
-        <w:t xml:space="preserve">Once you search for a university and click on it, you’ll see its financial profile.</w:t>
+        <w:t xml:space="preserve">Once you search for a university, you'll see its financial profile.</w:t>
       </w:r>
     </w:p>
     <w:p>
@@ -1324,7 +1363,7 @@
         </w:numPr>
       </w:pPr>
       <w:r>
-        <w:t xml:space="preserve">Red with a warning sign means a trend is growing in a concerning direction.</w:t>
+        <w:t xml:space="preserve">Red means a trend is heading in a concerning direction.</w:t>
       </w:r>
     </w:p>
     <w:p>
@@ -1336,7 +1375,7 @@
         </w:numPr>
       </w:pPr>
       <w:r>
-        <w:t xml:space="preserve">One or two red boxes do not automatically mean a school is in crisis.</w:t>
+        <w:t xml:space="preserve">Move your mouse over a warning sign to learn more about what it means.</w:t>
       </w:r>
     </w:p>
     <w:p>
@@ -1348,7 +1387,7 @@
         </w:numPr>
       </w:pPr>
       <w:r>
-        <w:t xml:space="preserve">But if a college shows several red indicators across revenue, enrollment and losses, that may be a sign of deeper financial pressure.</w:t>
+        <w:t xml:space="preserve">One or two red boxes do not automatically mean a school is in crisis.</w:t>
       </w:r>
     </w:p>
     <w:p>
@@ -1360,17 +1399,7 @@
         </w:numPr>
       </w:pPr>
       <w:r>
-        <w:t xml:space="preserve">Look out for the Pattern of warning signs indicator at the top of a profile. That signals the college has a pattern of falling net tuition revenue and enrollment over the previous 5 years as well as repeated losses.</w:t>
-      </w:r>
-    </w:p>
-    <w:p>
-      <w:r>
-        <w:t xml:space="preserve"/>
-      </w:r>
-    </w:p>
-    <w:p>
-      <w:r>
-        <w:t xml:space="preserve">Click on the tabs at the top of the page to learn about colleges that have:</w:t>
+        <w:t xml:space="preserve">But if a college shows several red indicators across revenue, enrollment and losses, that may be a sign of deeper financial pressure.</w:t>
       </w:r>
     </w:p>
     <w:p>
@@ -1382,7 +1411,7 @@
         </w:numPr>
       </w:pPr>
       <w:r>
-        <w:t xml:space="preserve">announced cuts to programs or staff,</w:t>
+        <w:t xml:space="preserve">Look for the Significant enrollment declines and losses indicator at the top of a profile. That means the college posted declines of at least 10 percent in both enrollment and net tuition revenue per student between 2019 and 2024 and had operating losses in at least three of those five years.</w:t>
       </w:r>
     </w:p>
     <w:p>
@@ -1394,7 +1423,17 @@
         </w:numPr>
       </w:pPr>
       <w:r>
-        <w:t xml:space="preserve">faced sanction from accreditors,</w:t>
+        <w:t xml:space="preserve">A gold At least 6 warning signs badge means at least six of the visible warning indicators on that profile are flagged as concerning.</w:t>
+      </w:r>
+    </w:p>
+    <w:p>
+      <w:r>
+        <w:t xml:space="preserve"/>
+      </w:r>
+    </w:p>
+    <w:p>
+      <w:r>
+        <w:t xml:space="preserve">Click on the tabs at the top of the page to learn about colleges that have:</w:t>
       </w:r>
     </w:p>
     <w:p>
@@ -1406,77 +1445,8 @@
         </w:numPr>
       </w:pPr>
       <w:r>
-        <w:t xml:space="preserve">or had federal research dollars terminated since 2025.</w:t>
-      </w:r>
-    </w:p>
-    <w:p>
-      <w:r>
-        <w:t xml:space="preserve"/>
-      </w:r>
-    </w:p>
-    <w:p>
-      <w:r>
-        <w:rPr>
-          <w:b/>
-          <w:bCs/>
-        </w:rPr>
-        <w:t xml:space="preserve">More questions about using this tool? Check our guide below.</w:t>
-      </w:r>
-    </w:p>
-    <w:p>
-      <w:r>
-        <w:t xml:space="preserve"/>
-      </w:r>
-    </w:p>
-    <w:p>
-      <w:pPr>
-        <w:pStyle w:val="Heading3"/>
-      </w:pPr>
-      <w:bookmarkStart w:name="s_school_search_tips" w:id="1"/>
-      <w:r>
-        <w:t xml:space="preserve">How to Search</w:t>
-      </w:r>
-      <w:bookmarkEnd w:id="1"/>
-    </w:p>
-    <w:p>
-      <w:r>
-        <w:t xml:space="preserve">Search by college name, nickname, state or its unique Integrated Postsecondary Education Data System ID.</w:t>
-      </w:r>
-    </w:p>
-    <w:p>
-      <w:r>
-        <w:t xml:space="preserve"/>
-      </w:r>
-    </w:p>
-    <w:p>
-      <w:r>
-        <w:t xml:space="preserve">For example: If you type in Massachusetts, you’ll see all the colleges included in our explorer in that state.</w:t>
-      </w:r>
-    </w:p>
-    <w:p>
-      <w:r>
-        <w:t xml:space="preserve"/>
-      </w:r>
-    </w:p>
-    <w:p>
-      <w:r>
-        <w:t xml:space="preserve">You can also search by nicknames like CalTech, MIT or Georgia Tech.</w:t>
-      </w:r>
-    </w:p>
-    <w:p>
-      <w:r>
-        <w:t xml:space="preserve"/>
-      </w:r>
-    </w:p>
-    <w:p>
-      <w:pPr>
-        <w:pStyle w:val="Heading3"/>
-      </w:pPr>
-      <w:bookmarkStart w:name="s_school_colors" w:id="1"/>
-      <w:r>
-        <w:t xml:space="preserve">What the Colors Mean</w:t>
-      </w:r>
-      <w:bookmarkEnd w:id="1"/>
+        <w:t xml:space="preserve">announced cuts to programs or staff,</w:t>
+      </w:r>
     </w:p>
     <w:p>
       <w:pPr>
@@ -1487,7 +1457,7 @@
         </w:numPr>
       </w:pPr>
       <w:r>
-        <w:t xml:space="preserve">Blue means a trend is moving in a positive direction.</w:t>
+        <w:t xml:space="preserve">faced sanctions from accreditors,</w:t>
       </w:r>
     </w:p>
     <w:p>
@@ -1499,8 +1469,77 @@
         </w:numPr>
       </w:pPr>
       <w:r>
-        <w:t xml:space="preserve">Red means a trend moved in a more concerning direction.</w:t>
-      </w:r>
+        <w:t xml:space="preserve">or had federal research dollars terminated since 2025.</w:t>
+      </w:r>
+    </w:p>
+    <w:p>
+      <w:r>
+        <w:t xml:space="preserve"/>
+      </w:r>
+    </w:p>
+    <w:p>
+      <w:r>
+        <w:rPr>
+          <w:b/>
+          <w:bCs/>
+        </w:rPr>
+        <w:t xml:space="preserve">More questions about using this tool? Keep reading.</w:t>
+      </w:r>
+    </w:p>
+    <w:p>
+      <w:r>
+        <w:t xml:space="preserve"/>
+      </w:r>
+    </w:p>
+    <w:p>
+      <w:pPr>
+        <w:pStyle w:val="Heading3"/>
+      </w:pPr>
+      <w:bookmarkStart w:name="s_school_search_tips" w:id="1"/>
+      <w:r>
+        <w:t xml:space="preserve">How to Search</w:t>
+      </w:r>
+      <w:bookmarkEnd w:id="1"/>
+    </w:p>
+    <w:p>
+      <w:r>
+        <w:t xml:space="preserve">Search by college name, nickname or state.</w:t>
+      </w:r>
+    </w:p>
+    <w:p>
+      <w:r>
+        <w:t xml:space="preserve"/>
+      </w:r>
+    </w:p>
+    <w:p>
+      <w:r>
+        <w:t xml:space="preserve">For example: If you type in Massachusetts, you'll see all the colleges included in our tracker in that state.</w:t>
+      </w:r>
+    </w:p>
+    <w:p>
+      <w:r>
+        <w:t xml:space="preserve"/>
+      </w:r>
+    </w:p>
+    <w:p>
+      <w:r>
+        <w:t xml:space="preserve">You can also search by nicknames like CalTech, MIT or Georgia Tech.</w:t>
+      </w:r>
+    </w:p>
+    <w:p>
+      <w:r>
+        <w:t xml:space="preserve"/>
+      </w:r>
+    </w:p>
+    <w:p>
+      <w:pPr>
+        <w:pStyle w:val="Heading3"/>
+      </w:pPr>
+      <w:bookmarkStart w:name="s_school_colors" w:id="1"/>
+      <w:r>
+        <w:t xml:space="preserve">What the Colors Mean</w:t>
+      </w:r>
+      <w:bookmarkEnd w:id="1"/>
     </w:p>
     <w:p>
       <w:pPr>
@@ -1511,61 +1550,7 @@
         </w:numPr>
       </w:pPr>
       <w:r>
-        <w:t xml:space="preserve">Yellow means the change was flat or minor.</w:t>
-      </w:r>
-    </w:p>
-    <w:p>
-      <w:r>
-        <w:t xml:space="preserve"/>
-      </w:r>
-    </w:p>
-    <w:p>
-      <w:r>
-        <w:rPr>
-          <w:i/>
-          <w:iCs/>
-        </w:rPr>
-        <w:t xml:space="preserve">For detail on how we define a concerning or positive change, head to our methodology.</w:t>
-      </w:r>
-    </w:p>
-    <w:p>
-      <w:r>
-        <w:t xml:space="preserve"/>
-      </w:r>
-    </w:p>
-    <w:p>
-      <w:pPr>
-        <w:pStyle w:val="Heading3"/>
-      </w:pPr>
-      <w:bookmarkStart w:name="s_school_examples" w:id="1"/>
-      <w:r>
-        <w:t xml:space="preserve">Example Financial Profiles</w:t>
-      </w:r>
-      <w:bookmarkEnd w:id="1"/>
-    </w:p>
-    <w:p>
-      <w:r>
-        <w:rPr>
-          <w:i/>
-          <w:iCs/>
-          <w:sz w:val="20"/>
-          <w:szCs w:val="20"/>
-        </w:rPr>
-        <w:t xml:space="preserve">The guide shows two static example school profiles with hard-coded illustrative data to demonstrate how the colored metric cards work.</w:t>
-      </w:r>
-    </w:p>
-    <w:p>
-      <w:r>
-        <w:t xml:space="preserve"/>
-      </w:r>
-    </w:p>
-    <w:p>
-      <w:r>
-        <w:rPr>
-          <w:b/>
-          <w:bCs/>
-        </w:rPr>
-        <w:t xml:space="preserve">Callout annotations on Example University:</w:t>
+        <w:t xml:space="preserve">Blue means a trend is moving in a positive direction.</w:t>
       </w:r>
     </w:p>
     <w:p>
@@ -1577,7 +1562,7 @@
         </w:numPr>
       </w:pPr>
       <w:r>
-        <w:t xml:space="preserve">This box is red because revenue is down by more than 5 percent.</w:t>
+        <w:t xml:space="preserve">Red means a trend moved in a more concerning direction.</w:t>
       </w:r>
     </w:p>
     <w:p>
@@ -1589,7 +1574,69 @@
         </w:numPr>
       </w:pPr>
       <w:r>
-        <w:t xml:space="preserve">This box is red because enrollment fell by more than 5 percent.</w:t>
+        <w:t xml:space="preserve">Yellow means there was no, or only a minor, change.</w:t>
+      </w:r>
+    </w:p>
+    <w:p>
+      <w:r>
+        <w:t xml:space="preserve"/>
+      </w:r>
+    </w:p>
+    <w:p>
+      <w:r>
+        <w:rPr>
+          <w:i/>
+          <w:iCs/>
+        </w:rPr>
+        <w:t xml:space="preserve">For detail on how we define a concerning or positive change, head to our methodology.</w:t>
+      </w:r>
+    </w:p>
+    <w:p>
+      <w:r>
+        <w:t xml:space="preserve"/>
+      </w:r>
+    </w:p>
+    <w:p>
+      <w:pPr>
+        <w:pStyle w:val="Heading3"/>
+      </w:pPr>
+      <w:bookmarkStart w:name="s_school_examples" w:id="1"/>
+      <w:r>
+        <w:t xml:space="preserve">Here are some examples of what information you may see on the profile --</w:t>
+      </w:r>
+      <w:bookmarkEnd w:id="1"/>
+    </w:p>
+    <w:p>
+      <w:r>
+        <w:t xml:space="preserve"/>
+      </w:r>
+    </w:p>
+    <w:p>
+      <w:r>
+        <w:rPr>
+          <w:i/>
+          <w:iCs/>
+          <w:sz w:val="20"/>
+          <w:szCs w:val="20"/>
+        </w:rPr>
+        <w:t xml:space="preserve">Each example shows the same type of content you'll see on real school profiles: metric-strip cards (with bolded statements or yes/no answers), charts, and callout bubbles.</w:t>
+      </w:r>
+    </w:p>
+    <w:p>
+      <w:r>
+        <w:t xml:space="preserve"/>
+      </w:r>
+    </w:p>
+    <w:p>
+      <w:r>
+        <w:rPr>
+          <w:b/>
+          <w:bCs/>
+          <w:color w:val="777777"/>
+          <w:sz w:val="18"/>
+          <w:szCs w:val="18"/>
+        </w:rPr>
+        <w:t xml:space="preserve">EXAMPLE UNIVERSITY — WARNING BADGES SHOWN</w:t>
       </w:r>
     </w:p>
     <w:p>
@@ -1601,7 +1648,7 @@
         </w:numPr>
       </w:pPr>
       <w:r>
-        <w:t xml:space="preserve">This box is red because net tuition revenue per student fell sharply.</w:t>
+        <w:t xml:space="preserve">Significant enrollment declines and losses</w:t>
       </w:r>
     </w:p>
     <w:p>
@@ -1613,7 +1660,24 @@
         </w:numPr>
       </w:pPr>
       <w:r>
-        <w:t xml:space="preserve">This box is blue because the endowment grew by more than 5 percent.</w:t>
+        <w:t xml:space="preserve">At least 6 warning signs</w:t>
+      </w:r>
+    </w:p>
+    <w:p>
+      <w:r>
+        <w:t xml:space="preserve"/>
+      </w:r>
+    </w:p>
+    <w:p>
+      <w:r>
+        <w:rPr>
+          <w:b/>
+          <w:bCs/>
+          <w:color w:val="777777"/>
+          <w:sz w:val="18"/>
+          <w:szCs w:val="18"/>
+        </w:rPr>
+        <w:t xml:space="preserve">EXAMPLE UNIVERSITY — METRIC CARD TEXT</w:t>
       </w:r>
     </w:p>
     <w:p>
@@ -1625,7 +1689,7 @@
         </w:numPr>
       </w:pPr>
       <w:r>
-        <w:t xml:space="preserve">This box is red because the college ended 8 years with a loss.</w:t>
+        <w:t xml:space="preserve">Revenue decreased 19 percent from 2019 to 2024, after adjusting for inflation.</w:t>
       </w:r>
     </w:p>
     <w:p>
@@ -1637,41 +1701,7 @@
         </w:numPr>
       </w:pPr>
       <w:r>
-        <w:t xml:space="preserve">This box is red because the college is seeing repeated enrollment drops.</w:t>
-      </w:r>
-    </w:p>
-    <w:p>
-      <w:r>
-        <w:t xml:space="preserve"/>
-      </w:r>
-    </w:p>
-    <w:p>
-      <w:r>
-        <w:t xml:space="preserve">This example school profile has a mix of red and blue boxes at the same time.</w:t>
-      </w:r>
-    </w:p>
-    <w:p>
-      <w:r>
-        <w:t xml:space="preserve">Revenue and enrollment are dropping significantly, and it has ended 8 of the past 10 years at a loss.</w:t>
-      </w:r>
-    </w:p>
-    <w:p>
-      <w:r>
-        <w:t xml:space="preserve">This suggests deeper financial pressure.</w:t>
-      </w:r>
-    </w:p>
-    <w:p>
-      <w:r>
-        <w:t xml:space="preserve"/>
-      </w:r>
-    </w:p>
-    <w:p>
-      <w:r>
-        <w:rPr>
-          <w:b/>
-          <w:bCs/>
-        </w:rPr>
-        <w:t xml:space="preserve">Callout annotations on Example State College:</w:t>
+        <w:t xml:space="preserve">Net tuition revenue per full-time equivalent student decreased 23 percent from 2019 to 2024, after adjusting for inflation.</w:t>
       </w:r>
     </w:p>
     <w:p>
@@ -1683,7 +1713,7 @@
         </w:numPr>
       </w:pPr>
       <w:r>
-        <w:t xml:space="preserve">This box is blue because revenue is up by more than 5 percent.</w:t>
+        <w:t xml:space="preserve">How many times has this institution ended the year with a loss in the past decade? 8</w:t>
       </w:r>
     </w:p>
     <w:p>
@@ -1695,7 +1725,21 @@
         </w:numPr>
       </w:pPr>
       <w:r>
-        <w:t xml:space="preserve">This box is yellow because enrollment stayed about the same.</w:t>
+        <w:t xml:space="preserve">Did this institution see a decline in enrollment in 3 of the previous 5 years? Yes</w:t>
+      </w:r>
+    </w:p>
+    <w:p>
+      <w:r>
+        <w:t xml:space="preserve"/>
+      </w:r>
+    </w:p>
+    <w:p>
+      <w:r>
+        <w:rPr>
+          <w:b/>
+          <w:bCs/>
+        </w:rPr>
+        <w:t xml:space="preserve">Callout annotations on Example University:</w:t>
       </w:r>
     </w:p>
     <w:p>
@@ -1707,7 +1751,7 @@
         </w:numPr>
       </w:pPr>
       <w:r>
-        <w:t xml:space="preserve">This box is red because net tuition revenue per student fell by more than 5 percent.</w:t>
+        <w:t xml:space="preserve">This box is red because revenue is down by more than 10 percent.</w:t>
       </w:r>
     </w:p>
     <w:p>
@@ -1719,7 +1763,7 @@
         </w:numPr>
       </w:pPr>
       <w:r>
-        <w:t xml:space="preserve">This box is yellow because staff headcount stayed about the same.</w:t>
+        <w:t xml:space="preserve">This box is red because net tuition revenue per student fell sharply.</w:t>
       </w:r>
     </w:p>
     <w:p>
@@ -1731,7 +1775,7 @@
         </w:numPr>
       </w:pPr>
       <w:r>
-        <w:t xml:space="preserve">This box is blue because the college did not end 2024 with a loss.</w:t>
+        <w:t xml:space="preserve">This chart shows enrollment falling steadily over time.</w:t>
       </w:r>
     </w:p>
     <w:p>
@@ -1743,38 +1787,8 @@
         </w:numPr>
       </w:pPr>
       <w:r>
-        <w:t xml:space="preserve">This box is blue because state aid has gone up by more than 5 percent.</w:t>
-      </w:r>
-    </w:p>
-    <w:p>
-      <w:r>
-        <w:t xml:space="preserve"/>
-      </w:r>
-    </w:p>
-    <w:p>
-      <w:r>
-        <w:t xml:space="preserve">This example college profile has one red box but mostly blue and yellow ones.</w:t>
-      </w:r>
-    </w:p>
-    <w:p>
-      <w:r>
-        <w:t xml:space="preserve">That suggests the college has a stable, or mixed, financial picture.</w:t>
-      </w:r>
-    </w:p>
-    <w:p>
-      <w:r>
-        <w:t xml:space="preserve"/>
-      </w:r>
-    </w:p>
-    <w:p>
-      <w:pPr>
-        <w:pStyle w:val="Heading3"/>
-      </w:pPr>
-      <w:bookmarkStart w:name="s_school_next" w:id="1"/>
-      <w:r>
-        <w:t xml:space="preserve">Where to Look Next</w:t>
-      </w:r>
-      <w:bookmarkEnd w:id="1"/>
+        <w:t xml:space="preserve">This chart shows staffing also trending downward over time.</w:t>
+      </w:r>
     </w:p>
     <w:p>
       <w:pPr>
@@ -1785,7 +1799,7 @@
         </w:numPr>
       </w:pPr>
       <w:r>
-        <w:t xml:space="preserve">College Cuts: See layoffs, program closures or campus shutdowns.</w:t>
+        <w:t xml:space="preserve">This box is red because the college ended 8 years with a loss.</w:t>
       </w:r>
     </w:p>
     <w:p>
@@ -1797,7 +1811,44 @@
         </w:numPr>
       </w:pPr>
       <w:r>
-        <w:t xml:space="preserve">Accreditation: See warnings, probation or other actions.</w:t>
+        <w:t xml:space="preserve">This box is red because the college is seeing repeated enrollment drops.</w:t>
+      </w:r>
+    </w:p>
+    <w:p>
+      <w:r>
+        <w:t xml:space="preserve"/>
+      </w:r>
+    </w:p>
+    <w:p>
+      <w:r>
+        <w:t xml:space="preserve">This example school profile is filled with concerning signals.</w:t>
+      </w:r>
+    </w:p>
+    <w:p>
+      <w:r>
+        <w:t xml:space="preserve">Revenue, enrollment and staffing are all moving downward, and it has ended 8 of the past 10 years at a loss.</w:t>
+      </w:r>
+    </w:p>
+    <w:p>
+      <w:r>
+        <w:t xml:space="preserve">This suggests deeper financial pressure.</w:t>
+      </w:r>
+    </w:p>
+    <w:p>
+      <w:r>
+        <w:t xml:space="preserve"/>
+      </w:r>
+    </w:p>
+    <w:p>
+      <w:r>
+        <w:rPr>
+          <w:b/>
+          <w:bCs/>
+          <w:color w:val="777777"/>
+          <w:sz w:val="18"/>
+          <w:szCs w:val="18"/>
+        </w:rPr>
+        <w:t xml:space="preserve">EXAMPLE STATE COLLEGE — METRIC CARD TEXT</w:t>
       </w:r>
     </w:p>
     <w:p>
@@ -1809,7 +1860,7 @@
         </w:numPr>
       </w:pPr>
       <w:r>
-        <w:t xml:space="preserve">Research Funding Cuts: See whether federal grants were disrupted.</w:t>
+        <w:t xml:space="preserve">Revenue increased 12 percent from 2019 to 2024, after adjusting for inflation.</w:t>
       </w:r>
     </w:p>
     <w:p>
@@ -1821,6 +1872,194 @@
         </w:numPr>
       </w:pPr>
       <w:r>
+        <w:t xml:space="preserve">Net tuition revenue per full-time equivalent student decreased 12 percent from 2019 to 2024, after adjusting for inflation.</w:t>
+      </w:r>
+    </w:p>
+    <w:p>
+      <w:pPr>
+        <w:pStyle w:val="ListParagraph"/>
+        <w:numPr>
+          <w:ilvl w:val="0"/>
+          <w:numId w:val="2"/>
+        </w:numPr>
+      </w:pPr>
+      <w:r>
+        <w:t xml:space="preserve">Did this college end the latest year at a loss? No</w:t>
+      </w:r>
+    </w:p>
+    <w:p>
+      <w:pPr>
+        <w:pStyle w:val="ListParagraph"/>
+        <w:numPr>
+          <w:ilvl w:val="0"/>
+          <w:numId w:val="2"/>
+        </w:numPr>
+      </w:pPr>
+      <w:r>
+        <w:t xml:space="preserve">How much has state aid changed over the past 5 years? +25 percent</w:t>
+      </w:r>
+    </w:p>
+    <w:p>
+      <w:r>
+        <w:t xml:space="preserve"/>
+      </w:r>
+    </w:p>
+    <w:p>
+      <w:r>
+        <w:rPr>
+          <w:b/>
+          <w:bCs/>
+        </w:rPr>
+        <w:t xml:space="preserve">Callout annotations on Example State College:</w:t>
+      </w:r>
+    </w:p>
+    <w:p>
+      <w:pPr>
+        <w:pStyle w:val="ListParagraph"/>
+        <w:numPr>
+          <w:ilvl w:val="0"/>
+          <w:numId w:val="2"/>
+        </w:numPr>
+      </w:pPr>
+      <w:r>
+        <w:t xml:space="preserve">This box is blue because revenue is up by more than 10 percent.</w:t>
+      </w:r>
+    </w:p>
+    <w:p>
+      <w:pPr>
+        <w:pStyle w:val="ListParagraph"/>
+        <w:numPr>
+          <w:ilvl w:val="0"/>
+          <w:numId w:val="2"/>
+        </w:numPr>
+      </w:pPr>
+      <w:r>
+        <w:t xml:space="preserve">This box is red because net tuition revenue per student fell by more than 10 percent.</w:t>
+      </w:r>
+    </w:p>
+    <w:p>
+      <w:pPr>
+        <w:pStyle w:val="ListParagraph"/>
+        <w:numPr>
+          <w:ilvl w:val="0"/>
+          <w:numId w:val="2"/>
+        </w:numPr>
+      </w:pPr>
+      <w:r>
+        <w:t xml:space="preserve">This chart shows enrollment staying mostly flat over time.</w:t>
+      </w:r>
+    </w:p>
+    <w:p>
+      <w:pPr>
+        <w:pStyle w:val="ListParagraph"/>
+        <w:numPr>
+          <w:ilvl w:val="0"/>
+          <w:numId w:val="2"/>
+        </w:numPr>
+      </w:pPr>
+      <w:r>
+        <w:t xml:space="preserve">This chart shows the endowment staying basically the same over time.</w:t>
+      </w:r>
+    </w:p>
+    <w:p>
+      <w:pPr>
+        <w:pStyle w:val="ListParagraph"/>
+        <w:numPr>
+          <w:ilvl w:val="0"/>
+          <w:numId w:val="2"/>
+        </w:numPr>
+      </w:pPr>
+      <w:r>
+        <w:t xml:space="preserve">This box is blue because the college did not end 2024 with a loss.</w:t>
+      </w:r>
+    </w:p>
+    <w:p>
+      <w:pPr>
+        <w:pStyle w:val="ListParagraph"/>
+        <w:numPr>
+          <w:ilvl w:val="0"/>
+          <w:numId w:val="2"/>
+        </w:numPr>
+      </w:pPr>
+      <w:r>
+        <w:t xml:space="preserve">This box is blue because state aid has gone up by more than 10 percent.</w:t>
+      </w:r>
+    </w:p>
+    <w:p>
+      <w:r>
+        <w:t xml:space="preserve"/>
+      </w:r>
+    </w:p>
+    <w:p>
+      <w:r>
+        <w:t xml:space="preserve">This example college profile has one red box but mostly blue and yellow ones.</w:t>
+      </w:r>
+    </w:p>
+    <w:p>
+      <w:r>
+        <w:t xml:space="preserve">That suggests the college has a stable, or mixed, financial picture.</w:t>
+      </w:r>
+    </w:p>
+    <w:p>
+      <w:r>
+        <w:t xml:space="preserve"/>
+      </w:r>
+    </w:p>
+    <w:p>
+      <w:pPr>
+        <w:pStyle w:val="Heading3"/>
+      </w:pPr>
+      <w:bookmarkStart w:name="s_school_next" w:id="1"/>
+      <w:r>
+        <w:t xml:space="preserve">Where to Look Next</w:t>
+      </w:r>
+      <w:bookmarkEnd w:id="1"/>
+    </w:p>
+    <w:p>
+      <w:pPr>
+        <w:pStyle w:val="ListParagraph"/>
+        <w:numPr>
+          <w:ilvl w:val="0"/>
+          <w:numId w:val="2"/>
+        </w:numPr>
+      </w:pPr>
+      <w:r>
+        <w:t xml:space="preserve">College Cuts: See layoffs, program closures or campus shutdowns.</w:t>
+      </w:r>
+    </w:p>
+    <w:p>
+      <w:pPr>
+        <w:pStyle w:val="ListParagraph"/>
+        <w:numPr>
+          <w:ilvl w:val="0"/>
+          <w:numId w:val="2"/>
+        </w:numPr>
+      </w:pPr>
+      <w:r>
+        <w:t xml:space="preserve">Accreditation: See warnings, probation or other actions.</w:t>
+      </w:r>
+    </w:p>
+    <w:p>
+      <w:pPr>
+        <w:pStyle w:val="ListParagraph"/>
+        <w:numPr>
+          <w:ilvl w:val="0"/>
+          <w:numId w:val="2"/>
+        </w:numPr>
+      </w:pPr>
+      <w:r>
+        <w:t xml:space="preserve">Research Funding Cuts: See whether federal grants were disrupted.</w:t>
+      </w:r>
+    </w:p>
+    <w:p>
+      <w:pPr>
+        <w:pStyle w:val="ListParagraph"/>
+        <w:numPr>
+          <w:ilvl w:val="0"/>
+          <w:numId w:val="2"/>
+        </w:numPr>
+      </w:pPr>
+      <w:r>
         <w:t xml:space="preserve">Methodology: See where the numbers come from.</w:t>
       </w:r>
     </w:p>
@@ -1831,7 +2070,7 @@
     </w:p>
     <w:p>
       <w:r>
-        <w:t xml:space="preserve">Ready to search for an institution’s financial profile?</w:t>
+        <w:t xml:space="preserve">Ready to search for an institution's financial profile?</w:t>
       </w:r>
     </w:p>
     <w:p>
@@ -1885,7 +2124,7 @@
     </w:p>
     <w:p>
       <w:r>
-        <w:t xml:space="preserve">This school shows a pattern of declining enrollment, falling net tuition revenue per student and losses in 3 of the last 5 years. Across all [N] potential indicators for a [school type], [N] are flagged as concerning. This is a signal of sustained financial stress. Check out this institution’s audits for more context.</w:t>
+        <w:t xml:space="preserve">This school shows a pattern of declining enrollment, falling net tuition revenue per student and losses in 3 of the last 5 years. Across all [N] potential indicators for a [school type], [N] are flagged as concerning. This is a signal of sustained financial stress. Check out this institution's audits for more context.</w:t>
       </w:r>
     </w:p>
     <w:p>
@@ -2051,7 +2290,7 @@
     </w:p>
     <w:p>
       <w:r>
-        <w:t xml:space="preserve">Graduation rate, bachelor’s degree within 6 years</w:t>
+        <w:t xml:space="preserve">Graduation rate, bachelor's degree within 6 years</w:t>
       </w:r>
     </w:p>
     <w:p>
@@ -2129,9 +2368,73 @@
       <w:pPr>
         <w:pStyle w:val="Heading2"/>
       </w:pPr>
-      <w:bookmarkStart w:name="s_school_closure" w:id="1"/>
-      <w:r>
-        <w:t xml:space="preserve">Institution Closure Notice (NEW)</w:t>
+      <w:bookmarkStart w:name="s_school_actions" w:id="1"/>
+      <w:r>
+        <w:t xml:space="preserve">Profile Action Buttons (NEW)</w:t>
+      </w:r>
+      <w:bookmarkEnd w:id="1"/>
+    </w:p>
+    <w:p>
+      <w:r>
+        <w:rPr>
+          <w:b/>
+          <w:bCs/>
+          <w:color w:val="1F3864"/>
+          <w:sz w:val="18"/>
+          <w:szCs w:val="18"/>
+        </w:rPr>
+        <w:t xml:space="preserve">PRIMARY ACTION BUTTON</w:t>
+      </w:r>
+    </w:p>
+    <w:p>
+      <w:r>
+        <w:rPr>
+          <w:b w:val="false"/>
+          <w:bCs w:val="false"/>
+          <w:color w:val="1F3864"/>
+        </w:rPr>
+        <w:t xml:space="preserve">Download this college's data</w:t>
+      </w:r>
+    </w:p>
+    <w:p>
+      <w:r>
+        <w:t xml:space="preserve"/>
+      </w:r>
+    </w:p>
+    <w:p>
+      <w:r>
+        <w:rPr>
+          <w:b/>
+          <w:bCs/>
+          <w:color w:val="1F3864"/>
+          <w:sz w:val="18"/>
+          <w:szCs w:val="18"/>
+        </w:rPr>
+        <w:t xml:space="preserve">SECONDARY ACTION BUTTON</w:t>
+      </w:r>
+    </w:p>
+    <w:p>
+      <w:r>
+        <w:rPr>
+          <w:b w:val="false"/>
+          <w:bCs w:val="false"/>
+          <w:color w:val="1F3864"/>
+        </w:rPr>
+        <w:t xml:space="preserve">Share this profile</w:t>
+      </w:r>
+    </w:p>
+    <w:p>
+      <w:r>
+        <w:t xml:space="preserve"/>
+      </w:r>
+    </w:p>
+    <w:p>
+      <w:pPr>
+        <w:pStyle w:val="Heading2"/>
+      </w:pPr>
+      <w:bookmarkStart w:name="s_school_merger_closure" w:id="1"/>
+      <w:r>
+        <w:t xml:space="preserve">Announced Merger / Closure Badges (NEW)</w:t>
       </w:r>
       <w:bookmarkEnd w:id="1"/>
     </w:p>
@@ -2143,88 +2446,115 @@
           <w:sz w:val="20"/>
           <w:szCs w:val="20"/>
         </w:rPr>
-        <w:t xml:space="preserve">Shown only on profiles for institutions marked as closed in federal data. Appears near the top of the profile. Exact wording depends on what date detail IPEDS provides.</w:t>
-      </w:r>
-    </w:p>
-    <w:p>
-      <w:r>
-        <w:t xml:space="preserve"/>
-      </w:r>
-    </w:p>
-    <w:p>
-      <w:r>
-        <w:rPr>
-          <w:b/>
-          <w:bCs/>
-          <w:color w:val="1F3864"/>
-          <w:sz w:val="18"/>
-          <w:szCs w:val="18"/>
-        </w:rPr>
-        <w:t xml:space="preserve">WHEN AN EXACT CLOSE DATE IS AVAILABLE</w:t>
-      </w:r>
-    </w:p>
-    <w:p>
-      <w:r>
-        <w:rPr>
-          <w:b w:val="false"/>
-          <w:bCs w:val="false"/>
-          <w:color w:val="1F3864"/>
-        </w:rPr>
-        <w:t xml:space="preserve">This institution closed on [Month Day, Year], according to federal data.</w:t>
-      </w:r>
-    </w:p>
-    <w:p>
-      <w:r>
-        <w:t xml:space="preserve"/>
-      </w:r>
-    </w:p>
-    <w:p>
-      <w:r>
-        <w:rPr>
-          <w:b/>
-          <w:bCs/>
-          <w:color w:val="1F3864"/>
-          <w:sz w:val="18"/>
-          <w:szCs w:val="18"/>
-        </w:rPr>
-        <w:t xml:space="preserve">WHEN ONLY A DATE STRING (NOT A PARSED DATE) IS AVAILABLE</w:t>
-      </w:r>
-    </w:p>
-    <w:p>
-      <w:r>
-        <w:rPr>
-          <w:b w:val="false"/>
-          <w:bCs w:val="false"/>
-          <w:color w:val="1F3864"/>
-        </w:rPr>
-        <w:t xml:space="preserve">This institution closed as of [date string from federal data].</w:t>
-      </w:r>
-    </w:p>
-    <w:p>
-      <w:r>
-        <w:t xml:space="preserve"/>
-      </w:r>
-    </w:p>
-    <w:p>
-      <w:r>
-        <w:rPr>
-          <w:b/>
-          <w:bCs/>
-          <w:color w:val="1F3864"/>
-          <w:sz w:val="18"/>
-          <w:szCs w:val="18"/>
-        </w:rPr>
-        <w:t xml:space="preserve">WHEN ONLY A CLOSE YEAR IS AVAILABLE</w:t>
-      </w:r>
-    </w:p>
-    <w:p>
-      <w:r>
-        <w:rPr>
-          <w:b w:val="false"/>
-          <w:bCs w:val="false"/>
-          <w:color w:val="1F3864"/>
-        </w:rPr>
-        <w:t xml:space="preserve">This institution closed in [year], according to federal data.</w:t>
+        <w:t xml:space="preserve">Shown in the profile header only when relevant cuts-index data indicates an announced merger or closure. Both can appear on the same profile.</w:t>
+      </w:r>
+    </w:p>
+    <w:p>
+      <w:r>
+        <w:t xml:space="preserve"/>
+      </w:r>
+    </w:p>
+    <w:p>
+      <w:r>
+        <w:rPr>
+          <w:b/>
+          <w:bCs/>
+          <w:color w:val="1F3864"/>
+          <w:sz w:val="18"/>
+          <w:szCs w:val="18"/>
+        </w:rPr>
+        <w:t xml:space="preserve">MERGER ANNOUNCED — BADGE LABEL</w:t>
+      </w:r>
+    </w:p>
+    <w:p>
+      <w:r>
+        <w:rPr>
+          <w:b w:val="false"/>
+          <w:bCs w:val="false"/>
+          <w:color w:val="1F3864"/>
+        </w:rPr>
+        <w:t xml:space="preserve">Merger Announced</w:t>
+      </w:r>
+    </w:p>
+    <w:p>
+      <w:r>
+        <w:t xml:space="preserve"/>
+      </w:r>
+    </w:p>
+    <w:p>
+      <w:r>
+        <w:rPr>
+          <w:b/>
+          <w:bCs/>
+          <w:color w:val="1F3864"/>
+          <w:sz w:val="18"/>
+          <w:szCs w:val="18"/>
+        </w:rPr>
+        <w:t xml:space="preserve">MERGER ANNOUNCED — TOOLTIP</w:t>
+      </w:r>
+    </w:p>
+    <w:p>
+      <w:r>
+        <w:rPr>
+          <w:b w:val="false"/>
+          <w:bCs w:val="false"/>
+          <w:color w:val="1F3864"/>
+        </w:rPr>
+        <w:t xml:space="preserve">This institution has been absorbed by another institution.</w:t>
+      </w:r>
+    </w:p>
+    <w:p>
+      <w:r>
+        <w:t xml:space="preserve"/>
+      </w:r>
+    </w:p>
+    <w:p>
+      <w:r>
+        <w:rPr>
+          <w:b/>
+          <w:bCs/>
+          <w:color w:val="1F3864"/>
+          <w:sz w:val="18"/>
+          <w:szCs w:val="18"/>
+        </w:rPr>
+        <w:t xml:space="preserve">CLOSURE ANNOUNCED — BADGE LABEL</w:t>
+      </w:r>
+    </w:p>
+    <w:p>
+      <w:r>
+        <w:rPr>
+          <w:b w:val="false"/>
+          <w:bCs w:val="false"/>
+          <w:color w:val="1F3864"/>
+        </w:rPr>
+        <w:t xml:space="preserve">Closure Announced</w:t>
+      </w:r>
+    </w:p>
+    <w:p>
+      <w:r>
+        <w:t xml:space="preserve"/>
+      </w:r>
+    </w:p>
+    <w:p>
+      <w:r>
+        <w:rPr>
+          <w:b/>
+          <w:bCs/>
+          <w:color w:val="1F3864"/>
+          <w:sz w:val="18"/>
+          <w:szCs w:val="18"/>
+        </w:rPr>
+        <w:t xml:space="preserve">CLOSURE ANNOUNCED — TOOLTIP</w:t>
+      </w:r>
+    </w:p>
+    <w:p>
+      <w:r>
+        <w:rPr>
+          <w:b w:val="false"/>
+          <w:bCs w:val="false"/>
+          <w:color w:val="1F3864"/>
+        </w:rPr>
+        <w:t xml:space="preserve">This institution announced its closure in [year].</w:t>
       </w:r>
     </w:p>
     <w:p>
@@ -2236,122 +2566,9 @@
       <w:pPr>
         <w:pStyle w:val="Heading2"/>
       </w:pPr>
-      <w:bookmarkStart w:name="s_school_revenue" w:id="1"/>
-      <w:r>
-        <w:t xml:space="preserve">Revenue Trends</w:t>
-      </w:r>
-      <w:bookmarkEnd w:id="1"/>
-    </w:p>
-    <w:p>
-      <w:r>
-        <w:t xml:space="preserve">Revenue trends are a key indicator of whether a college is bringing in enough money to cover expenses. Examples of revenue include tuition, room and board, government aid, donations and endowment returns.</w:t>
-      </w:r>
-    </w:p>
-    <w:p>
-      <w:r>
-        <w:t xml:space="preserve"/>
-      </w:r>
-    </w:p>
-    <w:p>
-      <w:r>
-        <w:t xml:space="preserve">A college that spends more than it brings in is operating at a loss. Repeated losses can be a warning sign.</w:t>
-      </w:r>
-    </w:p>
-    <w:p>
-      <w:r>
-        <w:t xml:space="preserve"/>
-      </w:r>
-    </w:p>
-    <w:p>
-      <w:r>
-        <w:rPr>
-          <w:b/>
-          <w:bCs/>
-          <w:color w:val="777777"/>
-          <w:sz w:val="18"/>
-          <w:szCs w:val="18"/>
-        </w:rPr>
-        <w:t xml:space="preserve">METRIC QUESTION</w:t>
-      </w:r>
-    </w:p>
-    <w:p>
-      <w:r>
-        <w:t xml:space="preserve">Has this college been in the red in 3 of the last 5 years?</w:t>
-      </w:r>
-    </w:p>
-    <w:p>
-      <w:r>
-        <w:t xml:space="preserve"/>
-      </w:r>
-    </w:p>
-    <w:p>
-      <w:r>
-        <w:rPr>
-          <w:b/>
-          <w:bCs/>
-          <w:color w:val="777777"/>
-          <w:sz w:val="18"/>
-          <w:szCs w:val="18"/>
-        </w:rPr>
-        <w:t xml:space="preserve">METRIC QUESTION</w:t>
-      </w:r>
-    </w:p>
-    <w:p>
-      <w:r>
-        <w:t xml:space="preserve">How many times has this institution ended the year with a loss in the past decade?</w:t>
-      </w:r>
-    </w:p>
-    <w:p>
-      <w:r>
-        <w:t xml:space="preserve"/>
-      </w:r>
-    </w:p>
-    <w:p>
-      <w:r>
-        <w:rPr>
-          <w:b/>
-          <w:bCs/>
-          <w:color w:val="777777"/>
-          <w:sz w:val="18"/>
-          <w:szCs w:val="18"/>
-        </w:rPr>
-        <w:t xml:space="preserve">CHART TITLE</w:t>
-      </w:r>
-    </w:p>
-    <w:p>
-      <w:r>
-        <w:t xml:space="preserve">Revenue compared to expenses (adjusted for inflation)</w:t>
-      </w:r>
-    </w:p>
-    <w:p>
-      <w:r>
-        <w:rPr>
-          <w:b/>
-          <w:bCs/>
-          <w:color w:val="777777"/>
-          <w:sz w:val="18"/>
-          <w:szCs w:val="18"/>
-        </w:rPr>
-        <w:t xml:space="preserve">CHART SERIES</w:t>
-      </w:r>
-    </w:p>
-    <w:p>
-      <w:r>
-        <w:t xml:space="preserve">Revenue | Expenses</w:t>
-      </w:r>
-    </w:p>
-    <w:p>
-      <w:r>
-        <w:t xml:space="preserve"/>
-      </w:r>
-    </w:p>
-    <w:p>
-      <w:pPr>
-        <w:pStyle w:val="Heading3"/>
-      </w:pPr>
-      <w:bookmarkStart w:name="s_school_revenue_dynamic" w:id="1"/>
-      <w:r>
-        <w:t xml:space="preserve">Dynamic Text — Revenue Change (NEW)</w:t>
+      <w:bookmarkStart w:name="s_school_closure" w:id="1"/>
+      <w:r>
+        <w:t xml:space="preserve">Institution Closure Flag (IPEDS, NEW)</w:t>
       </w:r>
       <w:bookmarkEnd w:id="1"/>
     </w:p>
@@ -2363,215 +2580,88 @@
           <w:sz w:val="20"/>
           <w:szCs w:val="20"/>
         </w:rPr>
-        <w:t xml:space="preserve">Generated per institution from the most recent 5-year span of available data. One example of each scenario is shown below; institution names, years and percentages vary.</w:t>
-      </w:r>
-    </w:p>
-    <w:p>
-      <w:r>
-        <w:t xml:space="preserve"/>
-      </w:r>
-    </w:p>
-    <w:p>
-      <w:r>
-        <w:rPr>
-          <w:b/>
-          <w:bCs/>
-          <w:color w:val="1F3864"/>
-          <w:sz w:val="18"/>
-          <w:szCs w:val="18"/>
-        </w:rPr>
-        <w:t xml:space="preserve">WHEN REVENUE INCREASED</w:t>
-      </w:r>
-    </w:p>
-    <w:p>
-      <w:r>
-        <w:rPr>
-          <w:b w:val="false"/>
-          <w:bCs w:val="false"/>
-          <w:color w:val="1F3864"/>
-        </w:rPr>
-        <w:t xml:space="preserve">Revenue increased </w:t>
-      </w:r>
-      <w:r>
-        <w:rPr>
-          <w:b/>
-          <w:bCs/>
-          <w:color w:val="1F3864"/>
-        </w:rPr>
-        <w:t xml:space="preserve">12%</w:t>
-      </w:r>
-      <w:r>
-        <w:rPr>
-          <w:b w:val="false"/>
-          <w:bCs w:val="false"/>
-          <w:color w:val="1F3864"/>
-        </w:rPr>
-        <w:t xml:space="preserve"> from 2019 to 2024, after adjusting for inflation.</w:t>
-      </w:r>
-    </w:p>
-    <w:p>
-      <w:r>
-        <w:t xml:space="preserve"/>
-      </w:r>
-    </w:p>
-    <w:p>
-      <w:r>
-        <w:rPr>
-          <w:b/>
-          <w:bCs/>
-          <w:color w:val="1F3864"/>
-          <w:sz w:val="18"/>
-          <w:szCs w:val="18"/>
-        </w:rPr>
-        <w:t xml:space="preserve">WHEN REVENUE DECREASED</w:t>
-      </w:r>
-    </w:p>
-    <w:p>
-      <w:r>
-        <w:rPr>
-          <w:b w:val="false"/>
-          <w:bCs w:val="false"/>
-          <w:color w:val="1F3864"/>
-        </w:rPr>
-        <w:t xml:space="preserve">Revenue decreased </w:t>
-      </w:r>
-      <w:r>
-        <w:rPr>
-          <w:b/>
-          <w:bCs/>
-          <w:color w:val="1F3864"/>
-        </w:rPr>
-        <w:t xml:space="preserve">8%</w:t>
-      </w:r>
-      <w:r>
-        <w:rPr>
-          <w:b w:val="false"/>
-          <w:bCs w:val="false"/>
-          <w:color w:val="1F3864"/>
-        </w:rPr>
-        <w:t xml:space="preserve"> from 2019 to 2024, after adjusting for inflation.</w:t>
-      </w:r>
-    </w:p>
-    <w:p>
-      <w:r>
-        <w:t xml:space="preserve"/>
-      </w:r>
-    </w:p>
-    <w:p>
-      <w:r>
-        <w:rPr>
-          <w:b/>
-          <w:bCs/>
-          <w:color w:val="1F3864"/>
-          <w:sz w:val="18"/>
-          <w:szCs w:val="18"/>
-        </w:rPr>
-        <w:t xml:space="preserve">SECTOR-COMPARISON LINE — APPENDED WHEN A SECTOR BENCHMARK EXISTS (THREE VARIANTS; THIS SAME COMPARISON PATTERN IS REUSED FOR NET TUITION REVENUE, STATE AID, ENROLLMENT, STAFFING AND ENDOWMENT, BELOW)</w:t>
-      </w:r>
-    </w:p>
-    <w:p>
-      <w:r>
-        <w:rPr>
-          <w:b w:val="false"/>
-          <w:bCs w:val="false"/>
-          <w:color w:val="1F3864"/>
-        </w:rPr>
-        <w:t xml:space="preserve">That compares to </w:t>
-      </w:r>
-      <w:r>
-        <w:rPr>
-          <w:b/>
-          <w:bCs/>
-          <w:color w:val="1F3864"/>
-        </w:rPr>
-        <w:t xml:space="preserve">an 11% increase</w:t>
-      </w:r>
-      <w:r>
-        <w:rPr>
-          <w:b w:val="false"/>
-          <w:bCs w:val="false"/>
-          <w:color w:val="1F3864"/>
-        </w:rPr>
-        <w:t xml:space="preserve"> for all public colleges we track.</w:t>
-      </w:r>
-    </w:p>
-    <w:p>
-      <w:r>
-        <w:rPr>
-          <w:b w:val="false"/>
-          <w:bCs w:val="false"/>
-          <w:color w:val="1F3864"/>
-        </w:rPr>
-        <w:t xml:space="preserve">That compares to </w:t>
-      </w:r>
-      <w:r>
-        <w:rPr>
-          <w:b/>
-          <w:bCs/>
-          <w:color w:val="1F3864"/>
-        </w:rPr>
-        <w:t xml:space="preserve">a 6% decline</w:t>
-      </w:r>
-      <w:r>
-        <w:rPr>
-          <w:b w:val="false"/>
-          <w:bCs w:val="false"/>
-          <w:color w:val="1F3864"/>
-        </w:rPr>
-        <w:t xml:space="preserve"> for all private nonprofit colleges we track.</w:t>
-      </w:r>
-    </w:p>
-    <w:p>
-      <w:r>
-        <w:rPr>
-          <w:b w:val="false"/>
-          <w:bCs w:val="false"/>
-          <w:color w:val="1F3864"/>
-        </w:rPr>
-        <w:t xml:space="preserve">That compares to </w:t>
-      </w:r>
-      <w:r>
-        <w:rPr>
-          <w:b/>
-          <w:bCs/>
-          <w:color w:val="1F3864"/>
-        </w:rPr>
-        <w:t xml:space="preserve">about no change</w:t>
-      </w:r>
-      <w:r>
-        <w:rPr>
-          <w:b w:val="false"/>
-          <w:bCs w:val="false"/>
-          <w:color w:val="1F3864"/>
-        </w:rPr>
-        <w:t xml:space="preserve"> for all for-profit colleges we track.</w:t>
-      </w:r>
-    </w:p>
-    <w:p>
-      <w:r>
-        <w:t xml:space="preserve"/>
-      </w:r>
-    </w:p>
-    <w:p>
-      <w:r>
-        <w:rPr>
-          <w:b/>
-          <w:bCs/>
-          <w:color w:val="1F3864"/>
-          <w:sz w:val="18"/>
-          <w:szCs w:val="18"/>
-        </w:rPr>
-        <w:t xml:space="preserve">WHEN NO REVENUE DATA IS AVAILABLE</w:t>
-      </w:r>
-    </w:p>
-    <w:p>
-      <w:r>
-        <w:rPr>
-          <w:b w:val="false"/>
-          <w:bCs w:val="false"/>
-          <w:color w:val="1F3864"/>
-        </w:rPr>
-        <w:t xml:space="preserve">Revenue data are not available.</w:t>
+        <w:t xml:space="preserve">Shown only on profiles for institutions marked as closed in federal IPEDS data. Distinct from the Closure Announced badge above, which comes from the cuts index.</w:t>
+      </w:r>
+    </w:p>
+    <w:p>
+      <w:r>
+        <w:t xml:space="preserve"/>
+      </w:r>
+    </w:p>
+    <w:p>
+      <w:r>
+        <w:rPr>
+          <w:b/>
+          <w:bCs/>
+          <w:color w:val="1F3864"/>
+          <w:sz w:val="18"/>
+          <w:szCs w:val="18"/>
+        </w:rPr>
+        <w:t xml:space="preserve">WHEN AN EXACT CLOSE DATE IS AVAILABLE</w:t>
+      </w:r>
+    </w:p>
+    <w:p>
+      <w:r>
+        <w:rPr>
+          <w:b w:val="false"/>
+          <w:bCs w:val="false"/>
+          <w:color w:val="1F3864"/>
+        </w:rPr>
+        <w:t xml:space="preserve">This institution closed on [Month Day, Year], according to federal data.</w:t>
+      </w:r>
+    </w:p>
+    <w:p>
+      <w:r>
+        <w:t xml:space="preserve"/>
+      </w:r>
+    </w:p>
+    <w:p>
+      <w:r>
+        <w:rPr>
+          <w:b/>
+          <w:bCs/>
+          <w:color w:val="1F3864"/>
+          <w:sz w:val="18"/>
+          <w:szCs w:val="18"/>
+        </w:rPr>
+        <w:t xml:space="preserve">WHEN ONLY A DATE STRING (NOT A PARSED DATE) IS AVAILABLE</w:t>
+      </w:r>
+    </w:p>
+    <w:p>
+      <w:r>
+        <w:rPr>
+          <w:b w:val="false"/>
+          <w:bCs w:val="false"/>
+          <w:color w:val="1F3864"/>
+        </w:rPr>
+        <w:t xml:space="preserve">This institution closed as of [date string from federal data].</w:t>
+      </w:r>
+    </w:p>
+    <w:p>
+      <w:r>
+        <w:t xml:space="preserve"/>
+      </w:r>
+    </w:p>
+    <w:p>
+      <w:r>
+        <w:rPr>
+          <w:b/>
+          <w:bCs/>
+          <w:color w:val="1F3864"/>
+          <w:sz w:val="18"/>
+          <w:szCs w:val="18"/>
+        </w:rPr>
+        <w:t xml:space="preserve">WHEN ONLY A CLOSE YEAR IS AVAILABLE</w:t>
+      </w:r>
+    </w:p>
+    <w:p>
+      <w:r>
+        <w:rPr>
+          <w:b w:val="false"/>
+          <w:bCs w:val="false"/>
+          <w:color w:val="1F3864"/>
+        </w:rPr>
+        <w:t xml:space="preserve">This institution closed in [year], according to federal data.</w:t>
       </w:r>
     </w:p>
     <w:p>
@@ -2583,35 +2673,25 @@
       <w:pPr>
         <w:pStyle w:val="Heading2"/>
       </w:pPr>
-      <w:bookmarkStart w:name="s_school_net_tuition" w:id="1"/>
-      <w:r>
-        <w:t xml:space="preserve">Net Tuition Revenue</w:t>
+      <w:bookmarkStart w:name="s_school_revenue" w:id="1"/>
+      <w:r>
+        <w:t xml:space="preserve">Revenue Trends</w:t>
       </w:r>
       <w:bookmarkEnd w:id="1"/>
     </w:p>
     <w:p>
       <w:r>
-        <w:t xml:space="preserve">Net tuition revenue shows how much money a college brings in per full-time equivalent student after institutional aid and other kinds of discounts.</w:t>
-      </w:r>
-    </w:p>
-    <w:p>
-      <w:r>
-        <w:t xml:space="preserve"/>
-      </w:r>
-    </w:p>
-    <w:p>
-      <w:r>
-        <w:t xml:space="preserve">When net tuition revenue falls, it can put pressure on college finances. But it can also mean a college is giving students more aid and lowering what they pay.</w:t>
-      </w:r>
-    </w:p>
-    <w:p>
-      <w:r>
-        <w:t xml:space="preserve"/>
-      </w:r>
-    </w:p>
-    <w:p>
-      <w:r>
-        <w:t xml:space="preserve">Higher dependence on tuition can make a college more financially vulnerable when enrollment drops.</w:t>
+        <w:t xml:space="preserve">Revenue trends are a key indicator of whether a college is bringing in enough money to cover expenses. Examples of revenue include tuition, room and board, government aid, donations and endowment returns.</w:t>
+      </w:r>
+    </w:p>
+    <w:p>
+      <w:r>
+        <w:t xml:space="preserve"/>
+      </w:r>
+    </w:p>
+    <w:p>
+      <w:r>
+        <w:t xml:space="preserve">A college that spends more than it brings in is operating at a loss. Repeated losses can be a warning sign.</w:t>
       </w:r>
     </w:p>
     <w:p>
@@ -2628,12 +2708,56 @@
           <w:sz w:val="18"/>
           <w:szCs w:val="18"/>
         </w:rPr>
+        <w:t xml:space="preserve">METRIC QUESTION</w:t>
+      </w:r>
+    </w:p>
+    <w:p>
+      <w:r>
+        <w:t xml:space="preserve">Has this college been in the red in 3 of the last 5 years?</w:t>
+      </w:r>
+    </w:p>
+    <w:p>
+      <w:r>
+        <w:t xml:space="preserve"/>
+      </w:r>
+    </w:p>
+    <w:p>
+      <w:r>
+        <w:rPr>
+          <w:b/>
+          <w:bCs/>
+          <w:color w:val="777777"/>
+          <w:sz w:val="18"/>
+          <w:szCs w:val="18"/>
+        </w:rPr>
+        <w:t xml:space="preserve">METRIC QUESTION</w:t>
+      </w:r>
+    </w:p>
+    <w:p>
+      <w:r>
+        <w:t xml:space="preserve">How many times has this institution ended the year with a loss in the past decade?</w:t>
+      </w:r>
+    </w:p>
+    <w:p>
+      <w:r>
+        <w:t xml:space="preserve"/>
+      </w:r>
+    </w:p>
+    <w:p>
+      <w:r>
+        <w:rPr>
+          <w:b/>
+          <w:bCs/>
+          <w:color w:val="777777"/>
+          <w:sz w:val="18"/>
+          <w:szCs w:val="18"/>
+        </w:rPr>
         <w:t xml:space="preserve">CHART TITLE</w:t>
       </w:r>
     </w:p>
     <w:p>
       <w:r>
-        <w:t xml:space="preserve">Net tuition revenue over time (per full-time equivalent student, adjusted for inflation)</w:t>
+        <w:t xml:space="preserve">Revenue compared to expenses (adjusted for inflation)</w:t>
       </w:r>
     </w:p>
     <w:p>
@@ -2650,7 +2774,7 @@
     </w:p>
     <w:p>
       <w:r>
-        <w:t xml:space="preserve">Net Tuition Revenue</w:t>
+        <w:t xml:space="preserve">Revenue | Expenses</w:t>
       </w:r>
     </w:p>
     <w:p>
@@ -2662,9 +2786,9 @@
       <w:pPr>
         <w:pStyle w:val="Heading3"/>
       </w:pPr>
-      <w:bookmarkStart w:name="s_school_tuition_dynamic" w:id="1"/>
-      <w:r>
-        <w:t xml:space="preserve">Dynamic Text — Net Tuition Change &amp; Tuition Dependence (NEW)</w:t>
+      <w:bookmarkStart w:name="s_school_revenue_dynamic" w:id="1"/>
+      <w:r>
+        <w:t xml:space="preserve">Dynamic Text — Revenue Change (NEW)</w:t>
       </w:r>
       <w:bookmarkEnd w:id="1"/>
     </w:p>
@@ -2676,42 +2800,42 @@
           <w:sz w:val="20"/>
           <w:szCs w:val="20"/>
         </w:rPr>
-        <w:t xml:space="preserve">Generated per institution from the most recent 5-year span of available data. One example of each scenario is shown below.</w:t>
-      </w:r>
-    </w:p>
-    <w:p>
-      <w:r>
-        <w:t xml:space="preserve"/>
-      </w:r>
-    </w:p>
-    <w:p>
-      <w:r>
-        <w:rPr>
-          <w:b/>
-          <w:bCs/>
-          <w:color w:val="1F3864"/>
-          <w:sz w:val="18"/>
-          <w:szCs w:val="18"/>
-        </w:rPr>
-        <w:t xml:space="preserve">WHEN NET TUITION REVENUE INCREASED (SAME INCREASED/DECREASED + SECTOR-COMPARISON PATTERN AS REVENUE TRENDS, ABOVE)</w:t>
-      </w:r>
-    </w:p>
-    <w:p>
-      <w:r>
-        <w:rPr>
-          <w:b w:val="false"/>
-          <w:bCs w:val="false"/>
-          <w:color w:val="1F3864"/>
-        </w:rPr>
-        <w:t xml:space="preserve">Net tuition revenue per full-time equivalent student increased </w:t>
-      </w:r>
-      <w:r>
-        <w:rPr>
-          <w:b/>
-          <w:bCs/>
-          <w:color w:val="1F3864"/>
-        </w:rPr>
-        <w:t xml:space="preserve">5%</w:t>
+        <w:t xml:space="preserve">Generated per institution from the most recent 5-year span of available data. One example of each scenario is shown below; institution names, years and percentages vary.</w:t>
+      </w:r>
+    </w:p>
+    <w:p>
+      <w:r>
+        <w:t xml:space="preserve"/>
+      </w:r>
+    </w:p>
+    <w:p>
+      <w:r>
+        <w:rPr>
+          <w:b/>
+          <w:bCs/>
+          <w:color w:val="1F3864"/>
+          <w:sz w:val="18"/>
+          <w:szCs w:val="18"/>
+        </w:rPr>
+        <w:t xml:space="preserve">WHEN REVENUE INCREASED</w:t>
+      </w:r>
+    </w:p>
+    <w:p>
+      <w:r>
+        <w:rPr>
+          <w:b w:val="false"/>
+          <w:bCs w:val="false"/>
+          <w:color w:val="1F3864"/>
+        </w:rPr>
+        <w:t xml:space="preserve">Revenue increased </w:t>
+      </w:r>
+      <w:r>
+        <w:rPr>
+          <w:b/>
+          <w:bCs/>
+          <w:color w:val="1F3864"/>
+        </w:rPr>
+        <w:t xml:space="preserve">12%</w:t>
       </w:r>
       <w:r>
         <w:rPr>
@@ -2736,25 +2860,25 @@
           <w:sz w:val="18"/>
           <w:szCs w:val="18"/>
         </w:rPr>
-        <w:t xml:space="preserve">WHEN NET TUITION REVENUE DECREASED</w:t>
-      </w:r>
-    </w:p>
-    <w:p>
-      <w:r>
-        <w:rPr>
-          <w:b w:val="false"/>
-          <w:bCs w:val="false"/>
-          <w:color w:val="1F3864"/>
-        </w:rPr>
-        <w:t xml:space="preserve">Net tuition revenue per full-time equivalent student decreased </w:t>
-      </w:r>
-      <w:r>
-        <w:rPr>
-          <w:b/>
-          <w:bCs/>
-          <w:color w:val="1F3864"/>
-        </w:rPr>
-        <w:t xml:space="preserve">9%</w:t>
+        <w:t xml:space="preserve">WHEN REVENUE DECREASED</w:t>
+      </w:r>
+    </w:p>
+    <w:p>
+      <w:r>
+        <w:rPr>
+          <w:b w:val="false"/>
+          <w:bCs w:val="false"/>
+          <w:color w:val="1F3864"/>
+        </w:rPr>
+        <w:t xml:space="preserve">Revenue decreased </w:t>
+      </w:r>
+      <w:r>
+        <w:rPr>
+          <w:b/>
+          <w:bCs/>
+          <w:color w:val="1F3864"/>
+        </w:rPr>
+        <w:t xml:space="preserve">8%</w:t>
       </w:r>
       <w:r>
         <w:rPr>
@@ -2779,189 +2903,112 @@
           <w:sz w:val="18"/>
           <w:szCs w:val="18"/>
         </w:rPr>
-        <w:t xml:space="preserve">WHEN NO NET TUITION REVENUE DATA IS AVAILABLE</w:t>
-      </w:r>
-    </w:p>
-    <w:p>
-      <w:r>
-        <w:rPr>
-          <w:b w:val="false"/>
-          <w:bCs w:val="false"/>
-          <w:color w:val="1F3864"/>
-        </w:rPr>
-        <w:t xml:space="preserve">Net tuition revenue per full-time equivalent student data are not available.</w:t>
-      </w:r>
-    </w:p>
-    <w:p>
-      <w:r>
-        <w:t xml:space="preserve"/>
-      </w:r>
-    </w:p>
-    <w:p>
-      <w:r>
-        <w:rPr>
-          <w:b/>
-          <w:bCs/>
-          <w:color w:val="1F3864"/>
-          <w:sz w:val="18"/>
-          <w:szCs w:val="18"/>
-        </w:rPr>
-        <w:t xml:space="preserve">TUITION DEPENDENCE — SHARE OF REVENUE ABOVE THE SECTOR MEDIAN</w:t>
-      </w:r>
-    </w:p>
-    <w:p>
-      <w:r>
-        <w:rPr>
-          <w:b w:val="false"/>
-          <w:bCs w:val="false"/>
-          <w:color w:val="1F3864"/>
-        </w:rPr>
-        <w:t xml:space="preserve">This college got </w:t>
-      </w:r>
-      <w:r>
-        <w:rPr>
-          <w:b/>
-          <w:bCs/>
-          <w:color w:val="1F3864"/>
-        </w:rPr>
-        <w:t xml:space="preserve">62% of its revenue from net tuition</w:t>
-      </w:r>
-      <w:r>
-        <w:rPr>
-          <w:b w:val="false"/>
-          <w:bCs w:val="false"/>
-          <w:color w:val="1F3864"/>
-        </w:rPr>
-        <w:t xml:space="preserve"> in 2024, above the median of 45% for private nonprofit colleges.</w:t>
-      </w:r>
-    </w:p>
-    <w:p>
-      <w:r>
-        <w:t xml:space="preserve"/>
-      </w:r>
-    </w:p>
-    <w:p>
-      <w:r>
-        <w:rPr>
-          <w:b/>
-          <w:bCs/>
-          <w:color w:val="1F3864"/>
-          <w:sz w:val="18"/>
-          <w:szCs w:val="18"/>
-        </w:rPr>
-        <w:t xml:space="preserve">TUITION DEPENDENCE — SHARE OF REVENUE BELOW THE SECTOR MEDIAN</w:t>
-      </w:r>
-    </w:p>
-    <w:p>
-      <w:r>
-        <w:rPr>
-          <w:b w:val="false"/>
-          <w:bCs w:val="false"/>
-          <w:color w:val="1F3864"/>
-        </w:rPr>
-        <w:t xml:space="preserve">This college got </w:t>
-      </w:r>
-      <w:r>
-        <w:rPr>
-          <w:b/>
-          <w:bCs/>
-          <w:color w:val="1F3864"/>
-        </w:rPr>
-        <w:t xml:space="preserve">38% of its revenue from net tuition</w:t>
-      </w:r>
-      <w:r>
-        <w:rPr>
-          <w:b w:val="false"/>
-          <w:bCs w:val="false"/>
-          <w:color w:val="1F3864"/>
-        </w:rPr>
-        <w:t xml:space="preserve"> in 2024, below the median of 45% for public colleges.</w:t>
-      </w:r>
-    </w:p>
-    <w:p>
-      <w:r>
-        <w:t xml:space="preserve"/>
-      </w:r>
-    </w:p>
-    <w:p>
-      <w:r>
-        <w:rPr>
-          <w:b/>
-          <w:bCs/>
-          <w:color w:val="1F3864"/>
-          <w:sz w:val="18"/>
-          <w:szCs w:val="18"/>
-        </w:rPr>
-        <w:t xml:space="preserve">TUITION DEPENDENCE — SHARE OF REVENUE ABOUT THE SAME AS THE SECTOR MEDIAN</w:t>
-      </w:r>
-    </w:p>
-    <w:p>
-      <w:r>
-        <w:rPr>
-          <w:b w:val="false"/>
-          <w:bCs w:val="false"/>
-          <w:color w:val="1F3864"/>
-        </w:rPr>
-        <w:t xml:space="preserve">This college got </w:t>
-      </w:r>
-      <w:r>
-        <w:rPr>
-          <w:b/>
-          <w:bCs/>
-          <w:color w:val="1F3864"/>
-        </w:rPr>
-        <w:t xml:space="preserve">45% of its revenue from net tuition</w:t>
-      </w:r>
-      <w:r>
-        <w:rPr>
-          <w:b w:val="false"/>
-          <w:bCs w:val="false"/>
-          <w:color w:val="1F3864"/>
-        </w:rPr>
-        <w:t xml:space="preserve"> in 2024, about the same as the median of 45% for private nonprofit colleges.</w:t>
-      </w:r>
-    </w:p>
-    <w:p>
-      <w:r>
-        <w:t xml:space="preserve"/>
-      </w:r>
-    </w:p>
-    <w:p>
-      <w:r>
-        <w:rPr>
-          <w:b/>
-          <w:bCs/>
-          <w:color w:val="1F3864"/>
-          <w:sz w:val="18"/>
-          <w:szCs w:val="18"/>
-        </w:rPr>
-        <w:t xml:space="preserve">TUITION DEPENDENCE — NO SECTOR BENCHMARK AVAILABLE</w:t>
-      </w:r>
-    </w:p>
-    <w:p>
-      <w:r>
-        <w:rPr>
-          <w:b w:val="false"/>
-          <w:bCs w:val="false"/>
-          <w:color w:val="1F3864"/>
-        </w:rPr>
-        <w:t xml:space="preserve">This college got </w:t>
-      </w:r>
-      <w:r>
-        <w:rPr>
-          <w:b/>
-          <w:bCs/>
-          <w:color w:val="1F3864"/>
-        </w:rPr>
-        <w:t xml:space="preserve">50% of its revenue from net tuition</w:t>
-      </w:r>
-      <w:r>
-        <w:rPr>
-          <w:b w:val="false"/>
-          <w:bCs w:val="false"/>
-          <w:color w:val="1F3864"/>
-        </w:rPr>
-        <w:t xml:space="preserve"> in 2024.</w:t>
+        <w:t xml:space="preserve">SECTOR-COMPARISON LINE — APPENDED WHEN A SECTOR BENCHMARK EXISTS (THREE VARIANTS; REUSED FOR NET TUITION REVENUE, STATE AID, ENROLLMENT, STAFFING AND ENDOWMENT, BELOW)</w:t>
+      </w:r>
+    </w:p>
+    <w:p>
+      <w:r>
+        <w:rPr>
+          <w:b w:val="false"/>
+          <w:bCs w:val="false"/>
+          <w:color w:val="1F3864"/>
+        </w:rPr>
+        <w:t xml:space="preserve">That compares to </w:t>
+      </w:r>
+      <w:r>
+        <w:rPr>
+          <w:b/>
+          <w:bCs/>
+          <w:color w:val="1F3864"/>
+        </w:rPr>
+        <w:t xml:space="preserve">an 11% increase</w:t>
+      </w:r>
+      <w:r>
+        <w:rPr>
+          <w:b w:val="false"/>
+          <w:bCs w:val="false"/>
+          <w:color w:val="1F3864"/>
+        </w:rPr>
+        <w:t xml:space="preserve"> for all public colleges we track.</w:t>
+      </w:r>
+    </w:p>
+    <w:p>
+      <w:r>
+        <w:rPr>
+          <w:b w:val="false"/>
+          <w:bCs w:val="false"/>
+          <w:color w:val="1F3864"/>
+        </w:rPr>
+        <w:t xml:space="preserve">That compares to </w:t>
+      </w:r>
+      <w:r>
+        <w:rPr>
+          <w:b/>
+          <w:bCs/>
+          <w:color w:val="1F3864"/>
+        </w:rPr>
+        <w:t xml:space="preserve">a 6% decline</w:t>
+      </w:r>
+      <w:r>
+        <w:rPr>
+          <w:b w:val="false"/>
+          <w:bCs w:val="false"/>
+          <w:color w:val="1F3864"/>
+        </w:rPr>
+        <w:t xml:space="preserve"> for all private nonprofit colleges we track.</w:t>
+      </w:r>
+    </w:p>
+    <w:p>
+      <w:r>
+        <w:rPr>
+          <w:b w:val="false"/>
+          <w:bCs w:val="false"/>
+          <w:color w:val="1F3864"/>
+        </w:rPr>
+        <w:t xml:space="preserve">That compares to </w:t>
+      </w:r>
+      <w:r>
+        <w:rPr>
+          <w:b/>
+          <w:bCs/>
+          <w:color w:val="1F3864"/>
+        </w:rPr>
+        <w:t xml:space="preserve">about no change</w:t>
+      </w:r>
+      <w:r>
+        <w:rPr>
+          <w:b w:val="false"/>
+          <w:bCs w:val="false"/>
+          <w:color w:val="1F3864"/>
+        </w:rPr>
+        <w:t xml:space="preserve"> for all for-profit colleges we track.</w:t>
+      </w:r>
+    </w:p>
+    <w:p>
+      <w:r>
+        <w:t xml:space="preserve"/>
+      </w:r>
+    </w:p>
+    <w:p>
+      <w:r>
+        <w:rPr>
+          <w:b/>
+          <w:bCs/>
+          <w:color w:val="1F3864"/>
+          <w:sz w:val="18"/>
+          <w:szCs w:val="18"/>
+        </w:rPr>
+        <w:t xml:space="preserve">WHEN NO REVENUE DATA IS AVAILABLE</w:t>
+      </w:r>
+    </w:p>
+    <w:p>
+      <w:r>
+        <w:rPr>
+          <w:b w:val="false"/>
+          <w:bCs w:val="false"/>
+          <w:color w:val="1F3864"/>
+        </w:rPr>
+        <w:t xml:space="preserve">Revenue data are not available.</w:t>
       </w:r>
     </w:p>
     <w:p>
@@ -2973,15 +3020,35 @@
       <w:pPr>
         <w:pStyle w:val="Heading2"/>
       </w:pPr>
-      <w:bookmarkStart w:name="s_school_state_aid" w:id="1"/>
-      <w:r>
-        <w:t xml:space="preserve">State Aid</w:t>
+      <w:bookmarkStart w:name="s_school_net_tuition" w:id="1"/>
+      <w:r>
+        <w:t xml:space="preserve">Net Tuition Revenue</w:t>
       </w:r>
       <w:bookmarkEnd w:id="1"/>
     </w:p>
     <w:p>
       <w:r>
-        <w:t xml:space="preserve">Some public colleges depend more than others on state funding. A higher share means the college is more exposed if that funding changes.</w:t>
+        <w:t xml:space="preserve">Net tuition revenue shows how much money a college brings in per full-time equivalent student after institutional aid and other kinds of discounts.</w:t>
+      </w:r>
+    </w:p>
+    <w:p>
+      <w:r>
+        <w:t xml:space="preserve"/>
+      </w:r>
+    </w:p>
+    <w:p>
+      <w:r>
+        <w:t xml:space="preserve">When net tuition revenue falls, it can put pressure on college finances. But it can also mean a college is giving students more aid and lowering what they pay.</w:t>
+      </w:r>
+    </w:p>
+    <w:p>
+      <w:r>
+        <w:t xml:space="preserve"/>
+      </w:r>
+    </w:p>
+    <w:p>
+      <w:r>
+        <w:t xml:space="preserve">Higher dependence on tuition can make a college more financially vulnerable when enrollment drops.</w:t>
       </w:r>
     </w:p>
     <w:p>
@@ -2998,12 +3065,12 @@
           <w:sz w:val="18"/>
           <w:szCs w:val="18"/>
         </w:rPr>
-        <w:t xml:space="preserve">EXPANDABLE SECTION TITLE (PRIVATE COLLEGES)</w:t>
-      </w:r>
-    </w:p>
-    <w:p>
-      <w:r>
-        <w:t xml:space="preserve">Want details about state aid?</w:t>
+        <w:t xml:space="preserve">CHART TITLE</w:t>
+      </w:r>
+    </w:p>
+    <w:p>
+      <w:r>
+        <w:t xml:space="preserve">Net tuition revenue over time (per full-time equivalent student, adjusted for inflation)</w:t>
       </w:r>
     </w:p>
     <w:p>
@@ -3015,99 +3082,12 @@
           <w:sz w:val="18"/>
           <w:szCs w:val="18"/>
         </w:rPr>
-        <w:t xml:space="preserve">EXPAND HINT</w:t>
-      </w:r>
-    </w:p>
-    <w:p>
-      <w:r>
-        <w:t xml:space="preserve">Expand for state-funding trends</w:t>
-      </w:r>
-    </w:p>
-    <w:p>
-      <w:r>
-        <w:t xml:space="preserve"/>
-      </w:r>
-    </w:p>
-    <w:p>
-      <w:r>
-        <w:rPr>
-          <w:b/>
-          <w:bCs/>
-          <w:color w:val="777777"/>
-          <w:sz w:val="18"/>
-          <w:szCs w:val="18"/>
-        </w:rPr>
-        <w:t xml:space="preserve">METRIC QUESTION</w:t>
-      </w:r>
-    </w:p>
-    <w:p>
-      <w:r>
-        <w:t xml:space="preserve">How much has state aid changed over the past 5 years?</w:t>
-      </w:r>
-    </w:p>
-    <w:p>
-      <w:r>
-        <w:t xml:space="preserve"/>
-      </w:r>
-    </w:p>
-    <w:p>
-      <w:r>
-        <w:rPr>
-          <w:b/>
-          <w:bCs/>
-          <w:color w:val="777777"/>
-          <w:sz w:val="18"/>
-          <w:szCs w:val="18"/>
-        </w:rPr>
-        <w:t xml:space="preserve">CHART TITLE</w:t>
-      </w:r>
-    </w:p>
-    <w:p>
-      <w:r>
-        <w:t xml:space="preserve">State government appropriations over time (adjusted for inflation)</w:t>
-      </w:r>
-    </w:p>
-    <w:p>
-      <w:r>
-        <w:rPr>
-          <w:b/>
-          <w:bCs/>
-          <w:color w:val="777777"/>
-          <w:sz w:val="18"/>
-          <w:szCs w:val="18"/>
-        </w:rPr>
         <w:t xml:space="preserve">CHART SERIES</w:t>
       </w:r>
     </w:p>
     <w:p>
       <w:r>
-        <w:t xml:space="preserve">State Funding</w:t>
-      </w:r>
-    </w:p>
-    <w:p>
-      <w:r>
-        <w:t xml:space="preserve"/>
-      </w:r>
-    </w:p>
-    <w:p>
-      <w:r>
-        <w:rPr>
-          <w:b/>
-          <w:bCs/>
-          <w:color w:val="777777"/>
-          <w:sz w:val="18"/>
-          <w:szCs w:val="18"/>
-        </w:rPr>
-        <w:t xml:space="preserve">CHART NOTE (WHEN APPLICABLE)</w:t>
-      </w:r>
-    </w:p>
-    <w:p>
-      <w:r>
-        <w:rPr>
-          <w:i/>
-          <w:iCs/>
-        </w:rPr>
-        <w:t xml:space="preserve">*IPEDS shows a negative state-appropriations value in at least one year for this institution. That may reflect a reporting adjustment or reclassification rather than negative aid in the everyday sense.</w:t>
+        <w:t xml:space="preserve">Net Tuition Revenue</w:t>
       </w:r>
     </w:p>
     <w:p>
@@ -3119,9 +3099,9 @@
       <w:pPr>
         <w:pStyle w:val="Heading3"/>
       </w:pPr>
-      <w:bookmarkStart w:name="s_school_state_aid_dynamic" w:id="1"/>
-      <w:r>
-        <w:t xml:space="preserve">Dynamic Text — State Aid Change (NEW)</w:t>
+      <w:bookmarkStart w:name="s_school_tuition_dynamic" w:id="1"/>
+      <w:r>
+        <w:t xml:space="preserve">Dynamic Text — Net Tuition Change &amp; Tuition Dependence (NEW)</w:t>
       </w:r>
       <w:bookmarkEnd w:id="1"/>
     </w:p>
@@ -3150,17 +3130,60 @@
           <w:sz w:val="18"/>
           <w:szCs w:val="18"/>
         </w:rPr>
-        <w:t xml:space="preserve">WHEN STATE AID INCREASED (SAME INCREASED/DECREASED + SECTOR-COMPARISON PATTERN AS REVENUE TRENDS, ABOVE)</w:t>
-      </w:r>
-    </w:p>
-    <w:p>
-      <w:r>
-        <w:rPr>
-          <w:b w:val="false"/>
-          <w:bCs w:val="false"/>
-          <w:color w:val="1F3864"/>
-        </w:rPr>
-        <w:t xml:space="preserve">State aid increased </w:t>
+        <w:t xml:space="preserve">WHEN NET TUITION REVENUE INCREASED (SAME INCREASE/DECREASE + SECTOR-COMPARISON PATTERN AS REVENUE TRENDS, ABOVE)</w:t>
+      </w:r>
+    </w:p>
+    <w:p>
+      <w:r>
+        <w:rPr>
+          <w:b w:val="false"/>
+          <w:bCs w:val="false"/>
+          <w:color w:val="1F3864"/>
+        </w:rPr>
+        <w:t xml:space="preserve">Net tuition revenue per full-time equivalent student increased </w:t>
+      </w:r>
+      <w:r>
+        <w:rPr>
+          <w:b/>
+          <w:bCs/>
+          <w:color w:val="1F3864"/>
+        </w:rPr>
+        <w:t xml:space="preserve">5%</w:t>
+      </w:r>
+      <w:r>
+        <w:rPr>
+          <w:b w:val="false"/>
+          <w:bCs w:val="false"/>
+          <w:color w:val="1F3864"/>
+        </w:rPr>
+        <w:t xml:space="preserve"> from 2019 to 2024, after adjusting for inflation.</w:t>
+      </w:r>
+    </w:p>
+    <w:p>
+      <w:r>
+        <w:t xml:space="preserve"/>
+      </w:r>
+    </w:p>
+    <w:p>
+      <w:r>
+        <w:rPr>
+          <w:b/>
+          <w:bCs/>
+          <w:color w:val="1F3864"/>
+          <w:sz w:val="18"/>
+          <w:szCs w:val="18"/>
+        </w:rPr>
+        <w:t xml:space="preserve">WHEN NET TUITION REVENUE DECREASED</w:t>
+      </w:r>
+    </w:p>
+    <w:p>
+      <w:r>
+        <w:rPr>
+          <w:b w:val="false"/>
+          <w:bCs w:val="false"/>
+          <w:color w:val="1F3864"/>
+        </w:rPr>
+        <w:t xml:space="preserve">Net tuition revenue per full-time equivalent student decreased </w:t>
       </w:r>
       <w:r>
         <w:rPr>
@@ -3176,120 +3199,206 @@
           <w:bCs w:val="false"/>
           <w:color w:val="1F3864"/>
         </w:rPr>
-        <w:t xml:space="preserve"> from 2019 to 2024.</w:t>
-      </w:r>
-    </w:p>
-    <w:p>
-      <w:r>
-        <w:t xml:space="preserve"/>
-      </w:r>
-    </w:p>
-    <w:p>
-      <w:r>
-        <w:rPr>
-          <w:b/>
-          <w:bCs/>
-          <w:color w:val="1F3864"/>
-          <w:sz w:val="18"/>
-          <w:szCs w:val="18"/>
-        </w:rPr>
-        <w:t xml:space="preserve">WHEN STATE AID DECREASED</w:t>
-      </w:r>
-    </w:p>
-    <w:p>
-      <w:r>
-        <w:rPr>
-          <w:b w:val="false"/>
-          <w:bCs w:val="false"/>
-          <w:color w:val="1F3864"/>
-        </w:rPr>
-        <w:t xml:space="preserve">State aid decreased </w:t>
-      </w:r>
-      <w:r>
-        <w:rPr>
-          <w:b/>
-          <w:bCs/>
-          <w:color w:val="1F3864"/>
-        </w:rPr>
-        <w:t xml:space="preserve">7%</w:t>
-      </w:r>
-      <w:r>
-        <w:rPr>
-          <w:b w:val="false"/>
-          <w:bCs w:val="false"/>
-          <w:color w:val="1F3864"/>
-        </w:rPr>
-        <w:t xml:space="preserve"> from 2019 to 2024.</w:t>
-      </w:r>
-    </w:p>
-    <w:p>
-      <w:r>
-        <w:t xml:space="preserve"/>
-      </w:r>
-    </w:p>
-    <w:p>
-      <w:r>
-        <w:rPr>
-          <w:b/>
-          <w:bCs/>
-          <w:color w:val="1F3864"/>
-          <w:sz w:val="18"/>
-          <w:szCs w:val="18"/>
-        </w:rPr>
-        <w:t xml:space="preserve">SECTOR-COMPARISON LINE (SAME THREE VARIANTS AS REVENUE TRENDS, ABOVE)</w:t>
-      </w:r>
-    </w:p>
-    <w:p>
-      <w:r>
-        <w:rPr>
-          <w:b w:val="false"/>
-          <w:bCs w:val="false"/>
-          <w:color w:val="1F3864"/>
-        </w:rPr>
-        <w:t xml:space="preserve">That compares to </w:t>
-      </w:r>
-      <w:r>
-        <w:rPr>
-          <w:b/>
-          <w:bCs/>
-          <w:color w:val="1F3864"/>
-        </w:rPr>
-        <w:t xml:space="preserve">a 4% decline</w:t>
-      </w:r>
-      <w:r>
-        <w:rPr>
-          <w:b w:val="false"/>
-          <w:bCs w:val="false"/>
-          <w:color w:val="1F3864"/>
-        </w:rPr>
-        <w:t xml:space="preserve"> for all public colleges we track.</w:t>
-      </w:r>
-    </w:p>
-    <w:p>
-      <w:r>
-        <w:t xml:space="preserve"/>
-      </w:r>
-    </w:p>
-    <w:p>
-      <w:r>
-        <w:rPr>
-          <w:b/>
-          <w:bCs/>
-          <w:color w:val="1F3864"/>
-          <w:sz w:val="18"/>
-          <w:szCs w:val="18"/>
-        </w:rPr>
-        <w:t xml:space="preserve">WHEN NO STATE AID DATA IS AVAILABLE</w:t>
-      </w:r>
-    </w:p>
-    <w:p>
-      <w:r>
-        <w:rPr>
-          <w:b w:val="false"/>
-          <w:bCs w:val="false"/>
-          <w:color w:val="1F3864"/>
-        </w:rPr>
-        <w:t xml:space="preserve">State aid data are not available.</w:t>
+        <w:t xml:space="preserve"> from 2019 to 2024, after adjusting for inflation.</w:t>
+      </w:r>
+    </w:p>
+    <w:p>
+      <w:r>
+        <w:t xml:space="preserve"/>
+      </w:r>
+    </w:p>
+    <w:p>
+      <w:r>
+        <w:rPr>
+          <w:b/>
+          <w:bCs/>
+          <w:color w:val="1F3864"/>
+          <w:sz w:val="18"/>
+          <w:szCs w:val="18"/>
+        </w:rPr>
+        <w:t xml:space="preserve">WHEN NO NET TUITION REVENUE DATA IS AVAILABLE</w:t>
+      </w:r>
+    </w:p>
+    <w:p>
+      <w:r>
+        <w:rPr>
+          <w:b w:val="false"/>
+          <w:bCs w:val="false"/>
+          <w:color w:val="1F3864"/>
+        </w:rPr>
+        <w:t xml:space="preserve">Net tuition revenue per full-time equivalent student data are not available.</w:t>
+      </w:r>
+    </w:p>
+    <w:p>
+      <w:r>
+        <w:t xml:space="preserve"/>
+      </w:r>
+    </w:p>
+    <w:p>
+      <w:r>
+        <w:rPr>
+          <w:b/>
+          <w:bCs/>
+          <w:color w:val="1F3864"/>
+          <w:sz w:val="18"/>
+          <w:szCs w:val="18"/>
+        </w:rPr>
+        <w:t xml:space="preserve">TUITION DEPENDENCE — SHARE OF REVENUE ABOVE THE SECTOR MEDIAN</w:t>
+      </w:r>
+    </w:p>
+    <w:p>
+      <w:r>
+        <w:rPr>
+          <w:b w:val="false"/>
+          <w:bCs w:val="false"/>
+          <w:color w:val="1F3864"/>
+        </w:rPr>
+        <w:t xml:space="preserve">This college got </w:t>
+      </w:r>
+      <w:r>
+        <w:rPr>
+          <w:b/>
+          <w:bCs/>
+          <w:color w:val="1F3864"/>
+        </w:rPr>
+        <w:t xml:space="preserve">62% of its revenue from net tuition</w:t>
+      </w:r>
+      <w:r>
+        <w:rPr>
+          <w:b w:val="false"/>
+          <w:bCs w:val="false"/>
+          <w:color w:val="1F3864"/>
+        </w:rPr>
+        <w:t xml:space="preserve"> in 2024, above the median of 45% for private nonprofit colleges.</w:t>
+      </w:r>
+    </w:p>
+    <w:p>
+      <w:r>
+        <w:t xml:space="preserve"/>
+      </w:r>
+    </w:p>
+    <w:p>
+      <w:r>
+        <w:rPr>
+          <w:b/>
+          <w:bCs/>
+          <w:color w:val="1F3864"/>
+          <w:sz w:val="18"/>
+          <w:szCs w:val="18"/>
+        </w:rPr>
+        <w:t xml:space="preserve">TUITION DEPENDENCE — SHARE OF REVENUE BELOW THE SECTOR MEDIAN</w:t>
+      </w:r>
+    </w:p>
+    <w:p>
+      <w:r>
+        <w:rPr>
+          <w:b w:val="false"/>
+          <w:bCs w:val="false"/>
+          <w:color w:val="1F3864"/>
+        </w:rPr>
+        <w:t xml:space="preserve">This college got </w:t>
+      </w:r>
+      <w:r>
+        <w:rPr>
+          <w:b/>
+          <w:bCs/>
+          <w:color w:val="1F3864"/>
+        </w:rPr>
+        <w:t xml:space="preserve">38% of its revenue from net tuition</w:t>
+      </w:r>
+      <w:r>
+        <w:rPr>
+          <w:b w:val="false"/>
+          <w:bCs w:val="false"/>
+          <w:color w:val="1F3864"/>
+        </w:rPr>
+        <w:t xml:space="preserve"> in 2024, below the median of 45% for public colleges.</w:t>
+      </w:r>
+    </w:p>
+    <w:p>
+      <w:r>
+        <w:t xml:space="preserve"/>
+      </w:r>
+    </w:p>
+    <w:p>
+      <w:r>
+        <w:rPr>
+          <w:b/>
+          <w:bCs/>
+          <w:color w:val="1F3864"/>
+          <w:sz w:val="18"/>
+          <w:szCs w:val="18"/>
+        </w:rPr>
+        <w:t xml:space="preserve">TUITION DEPENDENCE — SHARE OF REVENUE ABOUT THE SAME AS THE SECTOR MEDIAN</w:t>
+      </w:r>
+    </w:p>
+    <w:p>
+      <w:r>
+        <w:rPr>
+          <w:b w:val="false"/>
+          <w:bCs w:val="false"/>
+          <w:color w:val="1F3864"/>
+        </w:rPr>
+        <w:t xml:space="preserve">This college got </w:t>
+      </w:r>
+      <w:r>
+        <w:rPr>
+          <w:b/>
+          <w:bCs/>
+          <w:color w:val="1F3864"/>
+        </w:rPr>
+        <w:t xml:space="preserve">45% of its revenue from net tuition</w:t>
+      </w:r>
+      <w:r>
+        <w:rPr>
+          <w:b w:val="false"/>
+          <w:bCs w:val="false"/>
+          <w:color w:val="1F3864"/>
+        </w:rPr>
+        <w:t xml:space="preserve"> in 2024, about the same as the median of 45% for private nonprofit colleges.</w:t>
+      </w:r>
+    </w:p>
+    <w:p>
+      <w:r>
+        <w:t xml:space="preserve"/>
+      </w:r>
+    </w:p>
+    <w:p>
+      <w:r>
+        <w:rPr>
+          <w:b/>
+          <w:bCs/>
+          <w:color w:val="1F3864"/>
+          <w:sz w:val="18"/>
+          <w:szCs w:val="18"/>
+        </w:rPr>
+        <w:t xml:space="preserve">TUITION DEPENDENCE — NO SECTOR BENCHMARK AVAILABLE</w:t>
+      </w:r>
+    </w:p>
+    <w:p>
+      <w:r>
+        <w:rPr>
+          <w:b w:val="false"/>
+          <w:bCs w:val="false"/>
+          <w:color w:val="1F3864"/>
+        </w:rPr>
+        <w:t xml:space="preserve">This college got </w:t>
+      </w:r>
+      <w:r>
+        <w:rPr>
+          <w:b/>
+          <w:bCs/>
+          <w:color w:val="1F3864"/>
+        </w:rPr>
+        <w:t xml:space="preserve">50% of its revenue from net tuition</w:t>
+      </w:r>
+      <w:r>
+        <w:rPr>
+          <w:b w:val="false"/>
+          <w:bCs w:val="false"/>
+          <w:color w:val="1F3864"/>
+        </w:rPr>
+        <w:t xml:space="preserve"> in 2024.</w:t>
       </w:r>
     </w:p>
     <w:p>
@@ -3301,15 +3410,15 @@
       <w:pPr>
         <w:pStyle w:val="Heading2"/>
       </w:pPr>
-      <w:bookmarkStart w:name="s_school_enrollment" w:id="1"/>
-      <w:r>
-        <w:t xml:space="preserve">Enrollment</w:t>
+      <w:bookmarkStart w:name="s_school_state_aid" w:id="1"/>
+      <w:r>
+        <w:t xml:space="preserve">State Aid</w:t>
       </w:r>
       <w:bookmarkEnd w:id="1"/>
     </w:p>
     <w:p>
       <w:r>
-        <w:t xml:space="preserve">Drops in enrollment over time can be an early warning sign of financial stress.</w:t>
+        <w:t xml:space="preserve">Some public colleges depend more than others on state funding. A higher share means the college is more exposed if that funding changes.</w:t>
       </w:r>
     </w:p>
     <w:p>
@@ -3326,39 +3435,68 @@
           <w:sz w:val="18"/>
           <w:szCs w:val="18"/>
         </w:rPr>
+        <w:t xml:space="preserve">EXPANDABLE SECTION TITLE (PRIVATE COLLEGES)</w:t>
+      </w:r>
+    </w:p>
+    <w:p>
+      <w:r>
+        <w:t xml:space="preserve">Want details about state aid?</w:t>
+      </w:r>
+    </w:p>
+    <w:p>
+      <w:r>
+        <w:rPr>
+          <w:b/>
+          <w:bCs/>
+          <w:color w:val="777777"/>
+          <w:sz w:val="18"/>
+          <w:szCs w:val="18"/>
+        </w:rPr>
+        <w:t xml:space="preserve">EXPAND HINT</w:t>
+      </w:r>
+    </w:p>
+    <w:p>
+      <w:r>
+        <w:t xml:space="preserve">Expand for state-funding trends</w:t>
+      </w:r>
+    </w:p>
+    <w:p>
+      <w:r>
+        <w:rPr>
+          <w:b/>
+          <w:bCs/>
+          <w:color w:val="777777"/>
+          <w:sz w:val="18"/>
+          <w:szCs w:val="18"/>
+        </w:rPr>
+        <w:t xml:space="preserve">COLLAPSIBLE SECTION INTRO (SHOWN INSIDE THE EXPANDABLE SECTION — SLIGHTLY DIFFERENT FROM THE PUBLIC-COLLEGE COPY ABOVE)</w:t>
+      </w:r>
+    </w:p>
+    <w:p>
+      <w:r>
+        <w:t xml:space="preserve">Some universities are more dependent than others on state funding. A higher share means the college is more exposed if that funding changes.</w:t>
+      </w:r>
+    </w:p>
+    <w:p>
+      <w:r>
+        <w:t xml:space="preserve"/>
+      </w:r>
+    </w:p>
+    <w:p>
+      <w:r>
+        <w:rPr>
+          <w:b/>
+          <w:bCs/>
+          <w:color w:val="777777"/>
+          <w:sz w:val="18"/>
+          <w:szCs w:val="18"/>
+        </w:rPr>
         <w:t xml:space="preserve">METRIC QUESTION</w:t>
       </w:r>
     </w:p>
     <w:p>
       <w:r>
-        <w:t xml:space="preserve">Did this institution see a decline in enrollment in 3 of the previous 5 years?</w:t>
-      </w:r>
-    </w:p>
-    <w:p>
-      <w:r>
-        <w:t xml:space="preserve"/>
-      </w:r>
-    </w:p>
-    <w:p>
-      <w:r>
-        <w:rPr>
-          <w:b/>
-          <w:bCs/>
-          <w:color w:val="1F3864"/>
-          <w:sz w:val="18"/>
-          <w:szCs w:val="18"/>
-        </w:rPr>
-        <w:t xml:space="preserve">GRADUATE-LOAN-CAP NOTE (NEW SINCE FIRST DRAFT)</w:t>
-      </w:r>
-    </w:p>
-    <w:p>
-      <w:r>
-        <w:rPr>
-          <w:b w:val="false"/>
-          <w:bCs w:val="false"/>
-          <w:color w:val="1F3864"/>
-        </w:rPr>
-        <w:t xml:space="preserve">Congress has capped federal loans for new graduate students starting July 1, 2026. This change could hit colleges with higher rates of graduate students who borrow.</w:t>
+        <w:t xml:space="preserve">How much has state aid changed over the past 5 years?</w:t>
       </w:r>
     </w:p>
     <w:p>
@@ -3380,7 +3518,7 @@
     </w:p>
     <w:p>
       <w:r>
-        <w:t xml:space="preserve">Enrollment trends (12-month unduplicated headcount)</w:t>
+        <w:t xml:space="preserve">State government appropriations over time (adjusted for inflation)</w:t>
       </w:r>
     </w:p>
     <w:p>
@@ -3397,7 +3535,33 @@
     </w:p>
     <w:p>
       <w:r>
-        <w:t xml:space="preserve">Total Enrollment | Undergraduate Enrollment | Graduate Enrollment</w:t>
+        <w:t xml:space="preserve">State Funding</w:t>
+      </w:r>
+    </w:p>
+    <w:p>
+      <w:r>
+        <w:t xml:space="preserve"/>
+      </w:r>
+    </w:p>
+    <w:p>
+      <w:r>
+        <w:rPr>
+          <w:b/>
+          <w:bCs/>
+          <w:color w:val="777777"/>
+          <w:sz w:val="18"/>
+          <w:szCs w:val="18"/>
+        </w:rPr>
+        <w:t xml:space="preserve">CHART NOTE (WHEN APPLICABLE)</w:t>
+      </w:r>
+    </w:p>
+    <w:p>
+      <w:r>
+        <w:rPr>
+          <w:i/>
+          <w:iCs/>
+        </w:rPr>
+        <w:t xml:space="preserve">*IPEDS shows a negative state-appropriations value in at least one year for this institution. That may reflect a reporting adjustment or reclassification rather than negative aid in the everyday sense.</w:t>
       </w:r>
     </w:p>
     <w:p>
@@ -3409,9 +3573,9 @@
       <w:pPr>
         <w:pStyle w:val="Heading3"/>
       </w:pPr>
-      <w:bookmarkStart w:name="s_school_enrollment_dynamic" w:id="1"/>
-      <w:r>
-        <w:t xml:space="preserve">Dynamic Text — Enrollment Change, International Students &amp; Grad Loans (NEW)</w:t>
+      <w:bookmarkStart w:name="s_school_state_aid_dynamic" w:id="1"/>
+      <w:r>
+        <w:t xml:space="preserve">Dynamic Text — State Aid Change (NEW)</w:t>
       </w:r>
       <w:bookmarkEnd w:id="1"/>
     </w:p>
@@ -3423,6 +3587,355 @@
           <w:sz w:val="20"/>
           <w:szCs w:val="20"/>
         </w:rPr>
+        <w:t xml:space="preserve">Generated per institution from the most recent 5-year span of available data. One example of each scenario is shown below.</w:t>
+      </w:r>
+    </w:p>
+    <w:p>
+      <w:r>
+        <w:t xml:space="preserve"/>
+      </w:r>
+    </w:p>
+    <w:p>
+      <w:r>
+        <w:rPr>
+          <w:b/>
+          <w:bCs/>
+          <w:color w:val="1F3864"/>
+          <w:sz w:val="18"/>
+          <w:szCs w:val="18"/>
+        </w:rPr>
+        <w:t xml:space="preserve">WHEN STATE AID INCREASED (SAME INCREASE/DECREASE + SECTOR-COMPARISON PATTERN AS REVENUE TRENDS, ABOVE)</w:t>
+      </w:r>
+    </w:p>
+    <w:p>
+      <w:r>
+        <w:rPr>
+          <w:b w:val="false"/>
+          <w:bCs w:val="false"/>
+          <w:color w:val="1F3864"/>
+        </w:rPr>
+        <w:t xml:space="preserve">State aid increased </w:t>
+      </w:r>
+      <w:r>
+        <w:rPr>
+          <w:b/>
+          <w:bCs/>
+          <w:color w:val="1F3864"/>
+        </w:rPr>
+        <w:t xml:space="preserve">9%</w:t>
+      </w:r>
+      <w:r>
+        <w:rPr>
+          <w:b w:val="false"/>
+          <w:bCs w:val="false"/>
+          <w:color w:val="1F3864"/>
+        </w:rPr>
+        <w:t xml:space="preserve"> from 2019 to 2024.</w:t>
+      </w:r>
+    </w:p>
+    <w:p>
+      <w:r>
+        <w:t xml:space="preserve"/>
+      </w:r>
+    </w:p>
+    <w:p>
+      <w:r>
+        <w:rPr>
+          <w:b/>
+          <w:bCs/>
+          <w:color w:val="1F3864"/>
+          <w:sz w:val="18"/>
+          <w:szCs w:val="18"/>
+        </w:rPr>
+        <w:t xml:space="preserve">WHEN STATE AID DECREASED</w:t>
+      </w:r>
+    </w:p>
+    <w:p>
+      <w:r>
+        <w:rPr>
+          <w:b w:val="false"/>
+          <w:bCs w:val="false"/>
+          <w:color w:val="1F3864"/>
+        </w:rPr>
+        <w:t xml:space="preserve">State aid decreased </w:t>
+      </w:r>
+      <w:r>
+        <w:rPr>
+          <w:b/>
+          <w:bCs/>
+          <w:color w:val="1F3864"/>
+        </w:rPr>
+        <w:t xml:space="preserve">7%</w:t>
+      </w:r>
+      <w:r>
+        <w:rPr>
+          <w:b w:val="false"/>
+          <w:bCs w:val="false"/>
+          <w:color w:val="1F3864"/>
+        </w:rPr>
+        <w:t xml:space="preserve"> from 2019 to 2024.</w:t>
+      </w:r>
+    </w:p>
+    <w:p>
+      <w:r>
+        <w:t xml:space="preserve"/>
+      </w:r>
+    </w:p>
+    <w:p>
+      <w:r>
+        <w:rPr>
+          <w:b/>
+          <w:bCs/>
+          <w:color w:val="1F3864"/>
+          <w:sz w:val="18"/>
+          <w:szCs w:val="18"/>
+        </w:rPr>
+        <w:t xml:space="preserve">SECTOR-COMPARISON LINE (SAME THREE VARIANTS AS REVENUE TRENDS, ABOVE)</w:t>
+      </w:r>
+    </w:p>
+    <w:p>
+      <w:r>
+        <w:rPr>
+          <w:b w:val="false"/>
+          <w:bCs w:val="false"/>
+          <w:color w:val="1F3864"/>
+        </w:rPr>
+        <w:t xml:space="preserve">That compares to </w:t>
+      </w:r>
+      <w:r>
+        <w:rPr>
+          <w:b/>
+          <w:bCs/>
+          <w:color w:val="1F3864"/>
+        </w:rPr>
+        <w:t xml:space="preserve">a 4% decline</w:t>
+      </w:r>
+      <w:r>
+        <w:rPr>
+          <w:b w:val="false"/>
+          <w:bCs w:val="false"/>
+          <w:color w:val="1F3864"/>
+        </w:rPr>
+        <w:t xml:space="preserve"> for all public colleges we track.</w:t>
+      </w:r>
+    </w:p>
+    <w:p>
+      <w:r>
+        <w:t xml:space="preserve"/>
+      </w:r>
+    </w:p>
+    <w:p>
+      <w:r>
+        <w:rPr>
+          <w:b/>
+          <w:bCs/>
+          <w:color w:val="1F3864"/>
+          <w:sz w:val="18"/>
+          <w:szCs w:val="18"/>
+        </w:rPr>
+        <w:t xml:space="preserve">WHEN NO STATE AID DATA IS AVAILABLE</w:t>
+      </w:r>
+    </w:p>
+    <w:p>
+      <w:r>
+        <w:rPr>
+          <w:b w:val="false"/>
+          <w:bCs w:val="false"/>
+          <w:color w:val="1F3864"/>
+        </w:rPr>
+        <w:t xml:space="preserve">State aid data are not available.</w:t>
+      </w:r>
+    </w:p>
+    <w:p>
+      <w:r>
+        <w:t xml:space="preserve"/>
+      </w:r>
+    </w:p>
+    <w:p>
+      <w:pPr>
+        <w:pStyle w:val="Heading2"/>
+      </w:pPr>
+      <w:bookmarkStart w:name="s_school_enrollment" w:id="1"/>
+      <w:r>
+        <w:t xml:space="preserve">Enrollment</w:t>
+      </w:r>
+      <w:bookmarkEnd w:id="1"/>
+    </w:p>
+    <w:p>
+      <w:r>
+        <w:t xml:space="preserve">Drops in enrollment over time can be an early warning sign of financial stress.</w:t>
+      </w:r>
+    </w:p>
+    <w:p>
+      <w:r>
+        <w:t xml:space="preserve"/>
+      </w:r>
+    </w:p>
+    <w:p>
+      <w:r>
+        <w:rPr>
+          <w:b/>
+          <w:bCs/>
+          <w:color w:val="1F3864"/>
+          <w:sz w:val="18"/>
+          <w:szCs w:val="18"/>
+        </w:rPr>
+        <w:t xml:space="preserve">ENROLLMENT TOTAL SENTENCE (NEW — DYNAMIC, SHOWN WHEN LATEST HEADCOUNT IS AVAILABLE)</w:t>
+      </w:r>
+    </w:p>
+    <w:p>
+      <w:r>
+        <w:rPr>
+          <w:b w:val="false"/>
+          <w:bCs w:val="false"/>
+          <w:color w:val="1F3864"/>
+        </w:rPr>
+        <w:t xml:space="preserve">As of </w:t>
+      </w:r>
+      <w:r>
+        <w:rPr>
+          <w:b/>
+          <w:bCs/>
+          <w:color w:val="1F3864"/>
+        </w:rPr>
+        <w:t xml:space="preserve">2024</w:t>
+      </w:r>
+      <w:r>
+        <w:rPr>
+          <w:b w:val="false"/>
+          <w:bCs w:val="false"/>
+          <w:color w:val="1F3864"/>
+        </w:rPr>
+        <w:t xml:space="preserve">, this institution reported a headcount of </w:t>
+      </w:r>
+      <w:r>
+        <w:rPr>
+          <w:b/>
+          <w:bCs/>
+          <w:color w:val="1F3864"/>
+        </w:rPr>
+        <w:t xml:space="preserve">12,450</w:t>
+      </w:r>
+      <w:r>
+        <w:rPr>
+          <w:b w:val="false"/>
+          <w:bCs w:val="false"/>
+          <w:color w:val="1F3864"/>
+        </w:rPr>
+        <w:t xml:space="preserve">.</w:t>
+      </w:r>
+    </w:p>
+    <w:p>
+      <w:r>
+        <w:t xml:space="preserve"/>
+      </w:r>
+    </w:p>
+    <w:p>
+      <w:r>
+        <w:rPr>
+          <w:b/>
+          <w:bCs/>
+          <w:color w:val="777777"/>
+          <w:sz w:val="18"/>
+          <w:szCs w:val="18"/>
+        </w:rPr>
+        <w:t xml:space="preserve">METRIC QUESTION</w:t>
+      </w:r>
+    </w:p>
+    <w:p>
+      <w:r>
+        <w:t xml:space="preserve">Did this institution see a decline in enrollment in 3 of the previous 5 years?</w:t>
+      </w:r>
+    </w:p>
+    <w:p>
+      <w:r>
+        <w:t xml:space="preserve"/>
+      </w:r>
+    </w:p>
+    <w:p>
+      <w:r>
+        <w:rPr>
+          <w:b/>
+          <w:bCs/>
+          <w:color w:val="1F3864"/>
+          <w:sz w:val="18"/>
+          <w:szCs w:val="18"/>
+        </w:rPr>
+        <w:t xml:space="preserve">GRADUATE-LOAN-CAP NOTE (NEW SINCE FIRST DRAFT)</w:t>
+      </w:r>
+    </w:p>
+    <w:p>
+      <w:r>
+        <w:rPr>
+          <w:b w:val="false"/>
+          <w:bCs w:val="false"/>
+          <w:color w:val="1F3864"/>
+        </w:rPr>
+        <w:t xml:space="preserve">Congress has capped federal loans for new graduate students starting July 1, 2026. This change could hit colleges with higher rates of graduate students who borrow.</w:t>
+      </w:r>
+    </w:p>
+    <w:p>
+      <w:r>
+        <w:t xml:space="preserve"/>
+      </w:r>
+    </w:p>
+    <w:p>
+      <w:r>
+        <w:rPr>
+          <w:b/>
+          <w:bCs/>
+          <w:color w:val="777777"/>
+          <w:sz w:val="18"/>
+          <w:szCs w:val="18"/>
+        </w:rPr>
+        <w:t xml:space="preserve">CHART TITLE</w:t>
+      </w:r>
+    </w:p>
+    <w:p>
+      <w:r>
+        <w:t xml:space="preserve">Enrollment trends (12-month unduplicated headcount)</w:t>
+      </w:r>
+    </w:p>
+    <w:p>
+      <w:r>
+        <w:rPr>
+          <w:b/>
+          <w:bCs/>
+          <w:color w:val="777777"/>
+          <w:sz w:val="18"/>
+          <w:szCs w:val="18"/>
+        </w:rPr>
+        <w:t xml:space="preserve">CHART SERIES</w:t>
+      </w:r>
+    </w:p>
+    <w:p>
+      <w:r>
+        <w:t xml:space="preserve">Total Enrollment | Undergraduate Enrollment | Graduate Enrollment</w:t>
+      </w:r>
+    </w:p>
+    <w:p>
+      <w:r>
+        <w:t xml:space="preserve"/>
+      </w:r>
+    </w:p>
+    <w:p>
+      <w:pPr>
+        <w:pStyle w:val="Heading3"/>
+      </w:pPr>
+      <w:bookmarkStart w:name="s_school_enrollment_dynamic" w:id="1"/>
+      <w:r>
+        <w:t xml:space="preserve">Dynamic Text — Enrollment Change, International Students &amp; Grad Loans (NEW)</w:t>
+      </w:r>
+      <w:bookmarkEnd w:id="1"/>
+    </w:p>
+    <w:p>
+      <w:r>
+        <w:rPr>
+          <w:i/>
+          <w:iCs/>
+          <w:sz w:val="20"/>
+          <w:szCs w:val="20"/>
+        </w:rPr>
         <w:t xml:space="preserve">Generated per institution. One example of each scenario is shown below.</w:t>
       </w:r>
     </w:p>
@@ -3440,7 +3953,7 @@
           <w:sz w:val="18"/>
           <w:szCs w:val="18"/>
         </w:rPr>
-        <w:t xml:space="preserve">WHEN ENROLLMENT INCREASED (SAME INCREASED/DECREASED + SECTOR-COMPARISON PATTERN AS REVENUE TRENDS, ABOVE)</w:t>
+        <w:t xml:space="preserve">WHEN ENROLLMENT INCREASED (SAME INCREASE/DECREASE + SECTOR-COMPARISON PATTERN AS REVENUE TRENDS, ABOVE)</w:t>
       </w:r>
     </w:p>
     <w:p>
@@ -3596,7 +4109,7 @@
           <w:sz w:val="18"/>
           <w:szCs w:val="18"/>
         </w:rPr>
-        <w:t xml:space="preserve">INTERNATIONAL STUDENTS — FULL DETAIL (SHOWN WHEN OVERALL, UNDERGRADUATE AND GRADUATE SHARES ARE ALL KNOWN)</w:t>
+        <w:t xml:space="preserve">INTERNATIONAL STUDENTS — FULL DETAIL (ALL/UNDERGRAD/GRAD SHARES KNOWN)</w:t>
       </w:r>
     </w:p>
     <w:p>
@@ -3639,7 +4152,7 @@
           <w:sz w:val="18"/>
           <w:szCs w:val="18"/>
         </w:rPr>
-        <w:t xml:space="preserve">INTERNATIONAL STUDENTS — OVERALL SHARE ONLY (SHOWN WHEN ONLY THE OVERALL SHARE IS KNOWN)</w:t>
+        <w:t xml:space="preserve">INTERNATIONAL STUDENTS — OVERALL SHARE ONLY (ONLY THE OVERALL SHARE IS KNOWN)</w:t>
       </w:r>
     </w:p>
     <w:p>

</xml_diff>